<commit_message>
Add Nectogale publication and harden site maintenance
</commit_message>
<xml_diff>
--- a/cv/OKOnditi_CV_2026.docx
+++ b/cv/OKOnditi_CV_2026.docx
@@ -56,7 +56,7 @@
       <w:pPr>
         <w:pStyle w:val="CVLinks"/>
       </w:pPr>
-      <w:hyperlink r:id="rId20">
+      <w:hyperlink r:id="rId18">
         <w:r>
           <w:rPr>
             <w:rStyle w:val="Hyperlink"/>
@@ -70,7 +70,7 @@
         </w:rPr>
         <w:t xml:space="preserve">   ·   </w:t>
       </w:r>
-      <w:hyperlink r:id="rId21">
+      <w:hyperlink r:id="rId19">
         <w:r>
           <w:rPr>
             <w:rStyle w:val="Hyperlink"/>
@@ -84,7 +84,7 @@
         </w:rPr>
         <w:t xml:space="preserve">   ·   </w:t>
       </w:r>
-      <w:hyperlink r:id="rId22">
+      <w:hyperlink r:id="rId20">
         <w:r>
           <w:rPr>
             <w:rStyle w:val="Hyperlink"/>
@@ -190,7 +190,7 @@
                 <w:color w:val="8A6520"/>
                 <w:sz w:val="34"/>
               </w:rPr>
-              <w:t xml:space="preserve">39</w:t>
+              <w:t xml:space="preserve">40</w:t>
             </w:r>
           </w:p>
           <w:p>
@@ -838,8 +838,8 @@
       </w:r>
       <w:r>
         <w:rPr>
+          <w:i/>
           <w:iCs/>
-          <w:i/>
         </w:rPr>
         <w:t xml:space="preserve">Lophuromys flavopunctatus</w:t>
       </w:r>
@@ -1034,7 +1034,7 @@
         <w:pStyle w:val="CVSubhead"/>
       </w:pPr>
       <w:r>
-        <w:t xml:space="preserve">Peer-reviewed journal articles (39)</w:t>
+        <w:t xml:space="preserve">Peer-reviewed journal articles (40)</w:t>
       </w:r>
     </w:p>
     <w:p>
@@ -1045,7 +1045,7 @@
         <w:rPr>
           <w:rStyle w:val="CVNum"/>
         </w:rPr>
-        <w:t xml:space="preserve">39.</w:t>
+        <w:t xml:space="preserve">40.</w:t>
       </w:r>
       <w:r>
         <w:tab/>
@@ -1058,8 +1058,8 @@
       </w:r>
       <w:r>
         <w:rPr>
+          <w:b/>
           <w:bCs/>
-          <w:b/>
         </w:rPr>
         <w:t xml:space="preserve">Onditi, K. O.</w:t>
       </w:r>
@@ -1071,8 +1071,8 @@
       </w:r>
       <w:r>
         <w:rPr>
+          <w:i/>
           <w:iCs/>
-          <w:i/>
         </w:rPr>
         <w:t xml:space="preserve">Zoosystema</w:t>
       </w:r>
@@ -1088,7 +1088,7 @@
         <w:rPr>
           <w:rStyle w:val="CVNum"/>
         </w:rPr>
-        <w:t xml:space="preserve">38.</w:t>
+        <w:t xml:space="preserve">39.</w:t>
       </w:r>
       <w:r>
         <w:tab/>
@@ -1101,8 +1101,8 @@
       </w:r>
       <w:r>
         <w:rPr>
+          <w:b/>
           <w:bCs/>
-          <w:b/>
         </w:rPr>
         <w:t xml:space="preserve">Onditi, K. O.</w:t>
       </w:r>
@@ -1117,24 +1117,24 @@
       </w:r>
       <w:r>
         <w:rPr>
+          <w:i/>
           <w:iCs/>
+        </w:rPr>
+        <w:t xml:space="preserve">Episoriculus</w:t>
+      </w:r>
+      <w:r>
+        <w:t xml:space="preserve"> </w:t>
+      </w:r>
+      <w:r>
+        <w:t xml:space="preserve">(Mammalia: Eulipotyphla: Soricidae), with descriptions of two new species.</w:t>
+      </w:r>
+      <w:r>
+        <w:t xml:space="preserve"> </w:t>
+      </w:r>
+      <w:r>
+        <w:rPr>
           <w:i/>
-        </w:rPr>
-        <w:t xml:space="preserve">Episoriculus</w:t>
-      </w:r>
-      <w:r>
-        <w:t xml:space="preserve"> </w:t>
-      </w:r>
-      <w:r>
-        <w:t xml:space="preserve">(Mammalia: Eulipotyphla: Soricidae), with descriptions of two new species.</w:t>
-      </w:r>
-      <w:r>
-        <w:t xml:space="preserve"> </w:t>
-      </w:r>
-      <w:r>
-        <w:rPr>
           <w:iCs/>
-          <w:i/>
         </w:rPr>
         <w:t xml:space="preserve">Zoological Research</w:t>
       </w:r>
@@ -1144,20 +1144,7 @@
       <w:r>
         <w:t xml:space="preserve"> </w:t>
       </w:r>
-      <w:r>
-        <w:rPr>
-          <w:iCs/>
-          <w:i/>
-        </w:rPr>
-        <w:t xml:space="preserve">Advance online publication</w:t>
-      </w:r>
-      <w:r>
-        <w:t xml:space="preserve">.</w:t>
-      </w:r>
-      <w:r>
-        <w:t xml:space="preserve"> </w:t>
-      </w:r>
-      <w:hyperlink r:id="rId23">
+      <w:hyperlink r:id="rId21">
         <w:r>
           <w:rPr>
             <w:rStyle w:val="Hyperlink"/>
@@ -1174,7 +1161,7 @@
         <w:rPr>
           <w:rStyle w:val="CVNum"/>
         </w:rPr>
-        <w:t xml:space="preserve">37.</w:t>
+        <w:t xml:space="preserve">38.</w:t>
       </w:r>
       <w:r>
         <w:tab/>
@@ -1187,8 +1174,8 @@
       </w:r>
       <w:r>
         <w:rPr>
+          <w:b/>
           <w:bCs/>
-          <w:b/>
         </w:rPr>
         <w:t xml:space="preserve">Onditi, K. O.</w:t>
       </w:r>
@@ -1200,8 +1187,8 @@
       </w:r>
       <w:r>
         <w:rPr>
+          <w:i/>
           <w:iCs/>
-          <w:i/>
         </w:rPr>
         <w:t xml:space="preserve">Vertebrate Zoology</w:t>
       </w:r>
@@ -1211,7 +1198,7 @@
       <w:r>
         <w:t xml:space="preserve"> </w:t>
       </w:r>
-      <w:hyperlink r:id="rId24">
+      <w:hyperlink r:id="rId22">
         <w:r>
           <w:rPr>
             <w:rStyle w:val="Hyperlink"/>
@@ -1228,7 +1215,7 @@
         <w:rPr>
           <w:rStyle w:val="CVNum"/>
         </w:rPr>
-        <w:t xml:space="preserve">36.</w:t>
+        <w:t xml:space="preserve">37.</w:t>
       </w:r>
       <w:r>
         <w:tab/>
@@ -1241,8 +1228,8 @@
       </w:r>
       <w:r>
         <w:rPr>
+          <w:b/>
           <w:bCs/>
-          <w:b/>
         </w:rPr>
         <w:t xml:space="preserve">Onditi, K. O.</w:t>
       </w:r>
@@ -1254,8 +1241,8 @@
       </w:r>
       <w:r>
         <w:rPr>
+          <w:i/>
           <w:iCs/>
-          <w:i/>
         </w:rPr>
         <w:t xml:space="preserve">Biological Conservation</w:t>
       </w:r>
@@ -1265,7 +1252,7 @@
       <w:r>
         <w:t xml:space="preserve"> </w:t>
       </w:r>
-      <w:hyperlink r:id="rId25">
+      <w:hyperlink r:id="rId23">
         <w:r>
           <w:rPr>
             <w:rStyle w:val="Hyperlink"/>
@@ -1282,7 +1269,7 @@
         <w:rPr>
           <w:rStyle w:val="CVNum"/>
         </w:rPr>
-        <w:t xml:space="preserve">35.</w:t>
+        <w:t xml:space="preserve">36.</w:t>
       </w:r>
       <w:r>
         <w:tab/>
@@ -1295,8 +1282,8 @@
       </w:r>
       <w:r>
         <w:rPr>
+          <w:b/>
           <w:bCs/>
-          <w:b/>
         </w:rPr>
         <w:t xml:space="preserve">Onditi, K. O.</w:t>
       </w:r>
@@ -1308,8 +1295,8 @@
       </w:r>
       <w:r>
         <w:rPr>
+          <w:i/>
           <w:iCs/>
-          <w:i/>
         </w:rPr>
         <w:t xml:space="preserve">Conservation Biology</w:t>
       </w:r>
@@ -1319,7 +1306,7 @@
       <w:r>
         <w:t xml:space="preserve"> </w:t>
       </w:r>
-      <w:hyperlink r:id="rId26">
+      <w:hyperlink r:id="rId24">
         <w:r>
           <w:rPr>
             <w:rStyle w:val="Hyperlink"/>
@@ -1336,7 +1323,7 @@
         <w:rPr>
           <w:rStyle w:val="CVNum"/>
         </w:rPr>
-        <w:t xml:space="preserve">34.</w:t>
+        <w:t xml:space="preserve">35.</w:t>
       </w:r>
       <w:r>
         <w:tab/>
@@ -1349,8 +1336,8 @@
       </w:r>
       <w:r>
         <w:rPr>
+          <w:b/>
           <w:bCs/>
-          <w:b/>
         </w:rPr>
         <w:t xml:space="preserve">Onditi, K. O.</w:t>
       </w:r>
@@ -1362,8 +1349,8 @@
       </w:r>
       <w:r>
         <w:rPr>
+          <w:i/>
           <w:iCs/>
-          <w:i/>
         </w:rPr>
         <w:t xml:space="preserve">Biodiversity and Conservation</w:t>
       </w:r>
@@ -1373,7 +1360,7 @@
       <w:r>
         <w:t xml:space="preserve"> </w:t>
       </w:r>
-      <w:hyperlink r:id="rId27">
+      <w:hyperlink r:id="rId25">
         <w:r>
           <w:rPr>
             <w:rStyle w:val="Hyperlink"/>
@@ -1390,7 +1377,7 @@
         <w:rPr>
           <w:rStyle w:val="CVNum"/>
         </w:rPr>
-        <w:t xml:space="preserve">33.</w:t>
+        <w:t xml:space="preserve">34.</w:t>
       </w:r>
       <w:r>
         <w:tab/>
@@ -1403,8 +1390,8 @@
       </w:r>
       <w:r>
         <w:rPr>
+          <w:b/>
           <w:bCs/>
-          <w:b/>
         </w:rPr>
         <w:t xml:space="preserve">Onditi, K. O.</w:t>
       </w:r>
@@ -1416,24 +1403,24 @@
       </w:r>
       <w:r>
         <w:rPr>
+          <w:i/>
           <w:iCs/>
+        </w:rPr>
+        <w:t xml:space="preserve">Uropsilus</w:t>
+      </w:r>
+      <w:r>
+        <w:t xml:space="preserve"> </w:t>
+      </w:r>
+      <w:r>
+        <w:t xml:space="preserve">(Uropsilinae, Talpidae) combining genomic, morphological and geographic evidence.</w:t>
+      </w:r>
+      <w:r>
+        <w:t xml:space="preserve"> </w:t>
+      </w:r>
+      <w:r>
+        <w:rPr>
           <w:i/>
-        </w:rPr>
-        <w:t xml:space="preserve">Uropsilus</w:t>
-      </w:r>
-      <w:r>
-        <w:t xml:space="preserve"> </w:t>
-      </w:r>
-      <w:r>
-        <w:t xml:space="preserve">(Uropsilinae, Talpidae) combining genomic, morphological and geographic evidence.</w:t>
-      </w:r>
-      <w:r>
-        <w:t xml:space="preserve"> </w:t>
-      </w:r>
-      <w:r>
-        <w:rPr>
           <w:iCs/>
-          <w:i/>
         </w:rPr>
         <w:t xml:space="preserve">Molecular Phylogenetics and Evolution</w:t>
       </w:r>
@@ -1443,7 +1430,7 @@
       <w:r>
         <w:t xml:space="preserve"> </w:t>
       </w:r>
-      <w:hyperlink r:id="rId28">
+      <w:hyperlink r:id="rId26">
         <w:r>
           <w:rPr>
             <w:rStyle w:val="Hyperlink"/>
@@ -1460,7 +1447,7 @@
         <w:rPr>
           <w:rStyle w:val="CVNum"/>
         </w:rPr>
-        <w:t xml:space="preserve">32.</w:t>
+        <w:t xml:space="preserve">33.</w:t>
       </w:r>
       <w:r>
         <w:tab/>
@@ -1473,8 +1460,8 @@
       </w:r>
       <w:r>
         <w:rPr>
+          <w:b/>
           <w:bCs/>
-          <w:b/>
         </w:rPr>
         <w:t xml:space="preserve">Onditi, K. O.</w:t>
       </w:r>
@@ -1489,8 +1476,8 @@
       </w:r>
       <w:r>
         <w:rPr>
+          <w:i/>
           <w:iCs/>
-          <w:i/>
         </w:rPr>
         <w:t xml:space="preserve">Systematic Biology</w:t>
       </w:r>
@@ -1500,7 +1487,7 @@
       <w:r>
         <w:t xml:space="preserve"> </w:t>
       </w:r>
-      <w:hyperlink r:id="rId29">
+      <w:hyperlink r:id="rId27">
         <w:r>
           <w:rPr>
             <w:rStyle w:val="Hyperlink"/>
@@ -1517,7 +1504,7 @@
         <w:rPr>
           <w:rStyle w:val="CVNum"/>
         </w:rPr>
-        <w:t xml:space="preserve">31.</w:t>
+        <w:t xml:space="preserve">32.</w:t>
       </w:r>
       <w:r>
         <w:tab/>
@@ -1530,8 +1517,8 @@
       </w:r>
       <w:r>
         <w:rPr>
+          <w:b/>
           <w:bCs/>
-          <w:b/>
         </w:rPr>
         <w:t xml:space="preserve">Onditi, K. O.</w:t>
       </w:r>
@@ -1543,8 +1530,8 @@
       </w:r>
       <w:r>
         <w:rPr>
+          <w:i/>
           <w:iCs/>
-          <w:i/>
         </w:rPr>
         <w:t xml:space="preserve">Global Change Biology</w:t>
       </w:r>
@@ -1554,7 +1541,7 @@
       <w:r>
         <w:t xml:space="preserve"> </w:t>
       </w:r>
-      <w:hyperlink r:id="rId30">
+      <w:hyperlink r:id="rId28">
         <w:r>
           <w:rPr>
             <w:rStyle w:val="Hyperlink"/>
@@ -1571,15 +1558,15 @@
         <w:rPr>
           <w:rStyle w:val="CVNum"/>
         </w:rPr>
-        <w:t xml:space="preserve">30.</w:t>
+        <w:t xml:space="preserve">31.</w:t>
       </w:r>
       <w:r>
         <w:tab/>
       </w:r>
       <w:r>
         <w:rPr>
+          <w:b/>
           <w:bCs/>
-          <w:b/>
         </w:rPr>
         <w:t xml:space="preserve">Onditi, K. O.</w:t>
       </w:r>
@@ -1591,21 +1578,21 @@
       </w:r>
       <w:r>
         <w:rPr>
+          <w:i/>
           <w:iCs/>
+        </w:rPr>
+        <w:t xml:space="preserve">Graphiurus</w:t>
+      </w:r>
+      <w:r>
+        <w:t xml:space="preserve">) revealed by ultraconserved elements and mitochondrial data.</w:t>
+      </w:r>
+      <w:r>
+        <w:t xml:space="preserve"> </w:t>
+      </w:r>
+      <w:r>
+        <w:rPr>
           <w:i/>
-        </w:rPr>
-        <w:t xml:space="preserve">Graphiurus</w:t>
-      </w:r>
-      <w:r>
-        <w:t xml:space="preserve">) revealed by ultraconserved elements and mitochondrial data.</w:t>
-      </w:r>
-      <w:r>
-        <w:t xml:space="preserve"> </w:t>
-      </w:r>
-      <w:r>
-        <w:rPr>
           <w:iCs/>
-          <w:i/>
         </w:rPr>
         <w:t xml:space="preserve">Molecular Phylogenetics and Evolution</w:t>
       </w:r>
@@ -1615,7 +1602,7 @@
       <w:r>
         <w:t xml:space="preserve"> </w:t>
       </w:r>
-      <w:hyperlink r:id="rId31">
+      <w:hyperlink r:id="rId29">
         <w:r>
           <w:rPr>
             <w:rStyle w:val="Hyperlink"/>
@@ -1632,6 +1619,76 @@
         <w:rPr>
           <w:rStyle w:val="CVNum"/>
         </w:rPr>
+        <w:t xml:space="preserve">30.</w:t>
+      </w:r>
+      <w:r>
+        <w:tab/>
+      </w:r>
+      <w:r>
+        <w:t xml:space="preserve">Pei, X., Li, Y.,</w:t>
+      </w:r>
+      <w:r>
+        <w:t xml:space="preserve"> </w:t>
+      </w:r>
+      <w:r>
+        <w:rPr>
+          <w:b/>
+          <w:bCs/>
+        </w:rPr>
+        <w:t xml:space="preserve">Onditi, K. O.</w:t>
+      </w:r>
+      <w:r>
+        <w:t xml:space="preserve">, Wang, H., Qin, W., Zhu, R., Li, Q., Song, W., Li, X., Zhu, Z., Chen, Z. &amp; Jiang, X. (2026). Phylogeny and evolutionary history of the genus</w:t>
+      </w:r>
+      <w:r>
+        <w:t xml:space="preserve"> </w:t>
+      </w:r>
+      <w:r>
+        <w:rPr>
+          <w:i/>
+          <w:iCs/>
+        </w:rPr>
+        <w:t xml:space="preserve">Nectogale</w:t>
+      </w:r>
+      <w:r>
+        <w:t xml:space="preserve"> </w:t>
+      </w:r>
+      <w:r>
+        <w:t xml:space="preserve">(Soricidae) inferred from whole–genome analyses, with description of a new species endemic to the Himalayas.</w:t>
+      </w:r>
+      <w:r>
+        <w:t xml:space="preserve"> </w:t>
+      </w:r>
+      <w:r>
+        <w:rPr>
+          <w:i/>
+          <w:iCs/>
+        </w:rPr>
+        <w:t xml:space="preserve">Molecular Phylogenetics and Evolution</w:t>
+      </w:r>
+      <w:r>
+        <w:t xml:space="preserve">, 108749.</w:t>
+      </w:r>
+      <w:r>
+        <w:t xml:space="preserve"> </w:t>
+      </w:r>
+      <w:hyperlink r:id="rId30">
+        <w:r>
+          <w:rPr>
+            <w:rStyle w:val="Hyperlink"/>
+          </w:rPr>
+          <w:t xml:space="preserve">doi:10.1016/j.ympev.2026.108749</w:t>
+        </w:r>
+      </w:hyperlink>
+    </w:p>
+    <w:p>
+      <w:pPr>
+        <w:pStyle w:val="CVPub"/>
+      </w:pPr>
+      <w:r>
+        <w:rPr>
+          <w:rStyle w:val="CVNum"/>
+        </w:rPr>
         <w:t xml:space="preserve">29.</w:t>
       </w:r>
       <w:r>
@@ -1645,8 +1702,8 @@
       </w:r>
       <w:r>
         <w:rPr>
+          <w:b/>
           <w:bCs/>
-          <w:b/>
         </w:rPr>
         <w:t xml:space="preserve">Onditi, K. O.</w:t>
       </w:r>
@@ -1658,8 +1715,8 @@
       </w:r>
       <w:r>
         <w:rPr>
+          <w:i/>
           <w:iCs/>
-          <w:i/>
         </w:rPr>
         <w:t xml:space="preserve">Global Ecology and Conservation</w:t>
       </w:r>
@@ -1669,7 +1726,7 @@
       <w:r>
         <w:t xml:space="preserve"> </w:t>
       </w:r>
-      <w:hyperlink r:id="rId32">
+      <w:hyperlink r:id="rId31">
         <w:r>
           <w:rPr>
             <w:rStyle w:val="Hyperlink"/>
@@ -1699,8 +1756,8 @@
       </w:r>
       <w:r>
         <w:rPr>
+          <w:b/>
           <w:bCs/>
-          <w:b/>
         </w:rPr>
         <w:t xml:space="preserve">Onditi, K. O.</w:t>
       </w:r>
@@ -1712,8 +1769,8 @@
       </w:r>
       <w:r>
         <w:rPr>
+          <w:i/>
           <w:iCs/>
-          <w:i/>
         </w:rPr>
         <w:t xml:space="preserve">Biological Conservation</w:t>
       </w:r>
@@ -1723,7 +1780,7 @@
       <w:r>
         <w:t xml:space="preserve"> </w:t>
       </w:r>
-      <w:hyperlink r:id="rId33">
+      <w:hyperlink r:id="rId32">
         <w:r>
           <w:rPr>
             <w:rStyle w:val="Hyperlink"/>
@@ -1753,8 +1810,8 @@
       </w:r>
       <w:r>
         <w:rPr>
+          <w:b/>
           <w:bCs/>
-          <w:b/>
         </w:rPr>
         <w:t xml:space="preserve">Onditi, K. O.</w:t>
       </w:r>
@@ -1766,8 +1823,8 @@
       </w:r>
       <w:r>
         <w:rPr>
+          <w:i/>
           <w:iCs/>
-          <w:i/>
         </w:rPr>
         <w:t xml:space="preserve">Journal of Applied Ecology</w:t>
       </w:r>
@@ -1777,7 +1834,7 @@
       <w:r>
         <w:t xml:space="preserve"> </w:t>
       </w:r>
-      <w:hyperlink r:id="rId34">
+      <w:hyperlink r:id="rId33">
         <w:r>
           <w:rPr>
             <w:rStyle w:val="Hyperlink"/>
@@ -1807,8 +1864,8 @@
       </w:r>
       <w:r>
         <w:rPr>
+          <w:b/>
           <w:bCs/>
-          <w:b/>
         </w:rPr>
         <w:t xml:space="preserve">Onditi, K. O.</w:t>
       </w:r>
@@ -1820,8 +1877,8 @@
       </w:r>
       <w:r>
         <w:rPr>
+          <w:i/>
           <w:iCs/>
-          <w:i/>
         </w:rPr>
         <w:t xml:space="preserve">Scientific Reports</w:t>
       </w:r>
@@ -1831,7 +1888,7 @@
       <w:r>
         <w:t xml:space="preserve"> </w:t>
       </w:r>
-      <w:hyperlink r:id="rId35">
+      <w:hyperlink r:id="rId34">
         <w:r>
           <w:rPr>
             <w:rStyle w:val="Hyperlink"/>
@@ -1855,8 +1912,8 @@
       </w:r>
       <w:r>
         <w:rPr>
+          <w:b/>
           <w:bCs/>
-          <w:b/>
         </w:rPr>
         <w:t xml:space="preserve">Onditi, K. O.</w:t>
       </w:r>
@@ -1868,8 +1925,8 @@
       </w:r>
       <w:r>
         <w:rPr>
+          <w:i/>
           <w:iCs/>
-          <w:i/>
         </w:rPr>
         <w:t xml:space="preserve">Ecosphere</w:t>
       </w:r>
@@ -1879,7 +1936,7 @@
       <w:r>
         <w:t xml:space="preserve"> </w:t>
       </w:r>
-      <w:hyperlink r:id="rId36">
+      <w:hyperlink r:id="rId35">
         <w:r>
           <w:rPr>
             <w:rStyle w:val="Hyperlink"/>
@@ -1909,8 +1966,8 @@
       </w:r>
       <w:r>
         <w:rPr>
+          <w:b/>
           <w:bCs/>
-          <w:b/>
         </w:rPr>
         <w:t xml:space="preserve">Onditi, K. O.</w:t>
       </w:r>
@@ -1922,21 +1979,21 @@
       </w:r>
       <w:r>
         <w:rPr>
+          <w:i/>
           <w:iCs/>
+        </w:rPr>
+        <w:t xml:space="preserve">Lemniscomys</w:t>
+      </w:r>
+      <w:r>
+        <w:t xml:space="preserve">): Cryptic diversity and habitat resilience.</w:t>
+      </w:r>
+      <w:r>
+        <w:t xml:space="preserve"> </w:t>
+      </w:r>
+      <w:r>
+        <w:rPr>
           <w:i/>
-        </w:rPr>
-        <w:t xml:space="preserve">Lemniscomys</w:t>
-      </w:r>
-      <w:r>
-        <w:t xml:space="preserve">): Cryptic diversity and habitat resilience.</w:t>
-      </w:r>
-      <w:r>
-        <w:t xml:space="preserve"> </w:t>
-      </w:r>
-      <w:r>
-        <w:rPr>
           <w:iCs/>
-          <w:i/>
         </w:rPr>
         <w:t xml:space="preserve">Zoological Research: Diversity and Conservation</w:t>
       </w:r>
@@ -1946,7 +2003,7 @@
       <w:r>
         <w:t xml:space="preserve"> </w:t>
       </w:r>
-      <w:hyperlink r:id="rId37">
+      <w:hyperlink r:id="rId36">
         <w:r>
           <w:rPr>
             <w:rStyle w:val="Hyperlink"/>
@@ -1976,8 +2033,8 @@
       </w:r>
       <w:r>
         <w:rPr>
+          <w:b/>
           <w:bCs/>
-          <w:b/>
         </w:rPr>
         <w:t xml:space="preserve">Onditi, K. O.</w:t>
       </w:r>
@@ -1989,8 +2046,8 @@
       </w:r>
       <w:r>
         <w:rPr>
+          <w:i/>
           <w:iCs/>
-          <w:i/>
         </w:rPr>
         <w:t xml:space="preserve">Zoological Research: Diversity and Conservation</w:t>
       </w:r>
@@ -2000,7 +2057,7 @@
       <w:r>
         <w:t xml:space="preserve"> </w:t>
       </w:r>
-      <w:hyperlink r:id="rId38">
+      <w:hyperlink r:id="rId37">
         <w:r>
           <w:rPr>
             <w:rStyle w:val="Hyperlink"/>
@@ -2030,8 +2087,8 @@
       </w:r>
       <w:r>
         <w:rPr>
+          <w:b/>
           <w:bCs/>
-          <w:b/>
         </w:rPr>
         <w:t xml:space="preserve">Onditi, K. O.</w:t>
       </w:r>
@@ -2043,8 +2100,8 @@
       </w:r>
       <w:r>
         <w:rPr>
+          <w:i/>
           <w:iCs/>
-          <w:i/>
         </w:rPr>
         <w:t xml:space="preserve">Life</w:t>
       </w:r>
@@ -2054,7 +2111,7 @@
       <w:r>
         <w:t xml:space="preserve"> </w:t>
       </w:r>
-      <w:hyperlink r:id="rId39">
+      <w:hyperlink r:id="rId38">
         <w:r>
           <w:rPr>
             <w:rStyle w:val="Hyperlink"/>
@@ -2078,8 +2135,8 @@
       </w:r>
       <w:r>
         <w:rPr>
+          <w:b/>
           <w:bCs/>
-          <w:b/>
         </w:rPr>
         <w:t xml:space="preserve">Onditi, K. O.</w:t>
       </w:r>
@@ -2091,8 +2148,8 @@
       </w:r>
       <w:r>
         <w:rPr>
+          <w:i/>
           <w:iCs/>
-          <w:i/>
         </w:rPr>
         <w:t xml:space="preserve">BMC Ecology and Evolution</w:t>
       </w:r>
@@ -2102,7 +2159,7 @@
       <w:r>
         <w:t xml:space="preserve"> </w:t>
       </w:r>
-      <w:hyperlink r:id="rId40">
+      <w:hyperlink r:id="rId39">
         <w:r>
           <w:rPr>
             <w:rStyle w:val="Hyperlink"/>
@@ -2132,8 +2189,8 @@
       </w:r>
       <w:r>
         <w:rPr>
+          <w:b/>
           <w:bCs/>
-          <w:b/>
         </w:rPr>
         <w:t xml:space="preserve">Onditi, K. O.</w:t>
       </w:r>
@@ -2145,21 +2202,21 @@
       </w:r>
       <w:r>
         <w:rPr>
+          <w:i/>
           <w:iCs/>
+        </w:rPr>
+        <w:t xml:space="preserve">Neodon</w:t>
+      </w:r>
+      <w:r>
+        <w:t xml:space="preserve">) from south Xizang, China.</w:t>
+      </w:r>
+      <w:r>
+        <w:t xml:space="preserve"> </w:t>
+      </w:r>
+      <w:r>
+        <w:rPr>
           <w:i/>
-        </w:rPr>
-        <w:t xml:space="preserve">Neodon</w:t>
-      </w:r>
-      <w:r>
-        <w:t xml:space="preserve">) from south Xizang, China.</w:t>
-      </w:r>
-      <w:r>
-        <w:t xml:space="preserve"> </w:t>
-      </w:r>
-      <w:r>
-        <w:rPr>
           <w:iCs/>
-          <w:i/>
         </w:rPr>
         <w:t xml:space="preserve">Zoological Research: Diversity and Conservation</w:t>
       </w:r>
@@ -2169,7 +2226,7 @@
       <w:r>
         <w:t xml:space="preserve"> </w:t>
       </w:r>
-      <w:hyperlink r:id="rId41">
+      <w:hyperlink r:id="rId40">
         <w:r>
           <w:rPr>
             <w:rStyle w:val="Hyperlink"/>
@@ -2199,8 +2256,8 @@
       </w:r>
       <w:r>
         <w:rPr>
+          <w:b/>
           <w:bCs/>
-          <w:b/>
         </w:rPr>
         <w:t xml:space="preserve">Onditi, K. O.</w:t>
       </w:r>
@@ -2212,24 +2269,24 @@
       </w:r>
       <w:r>
         <w:rPr>
+          <w:i/>
           <w:iCs/>
+        </w:rPr>
+        <w:t xml:space="preserve">Micromys</w:t>
+      </w:r>
+      <w:r>
+        <w:t xml:space="preserve"> </w:t>
+      </w:r>
+      <w:r>
+        <w:t xml:space="preserve">(Mammalia: Rodentia: Muridae).</w:t>
+      </w:r>
+      <w:r>
+        <w:t xml:space="preserve"> </w:t>
+      </w:r>
+      <w:r>
+        <w:rPr>
           <w:i/>
-        </w:rPr>
-        <w:t xml:space="preserve">Micromys</w:t>
-      </w:r>
-      <w:r>
-        <w:t xml:space="preserve"> </w:t>
-      </w:r>
-      <w:r>
-        <w:t xml:space="preserve">(Mammalia: Rodentia: Muridae).</w:t>
-      </w:r>
-      <w:r>
-        <w:t xml:space="preserve"> </w:t>
-      </w:r>
-      <w:r>
-        <w:rPr>
           <w:iCs/>
-          <w:i/>
         </w:rPr>
         <w:t xml:space="preserve">Mammalian Biology</w:t>
       </w:r>
@@ -2239,7 +2296,7 @@
       <w:r>
         <w:t xml:space="preserve"> </w:t>
       </w:r>
-      <w:hyperlink r:id="rId42">
+      <w:hyperlink r:id="rId41">
         <w:r>
           <w:rPr>
             <w:rStyle w:val="Hyperlink"/>
@@ -2269,8 +2326,8 @@
       </w:r>
       <w:r>
         <w:rPr>
+          <w:b/>
           <w:bCs/>
-          <w:b/>
         </w:rPr>
         <w:t xml:space="preserve">Onditi, K. O.</w:t>
       </w:r>
@@ -2285,8 +2342,8 @@
       </w:r>
       <w:r>
         <w:rPr>
+          <w:i/>
           <w:iCs/>
-          <w:i/>
         </w:rPr>
         <w:t xml:space="preserve">Journal of Mammalogy</w:t>
       </w:r>
@@ -2296,7 +2353,7 @@
       <w:r>
         <w:t xml:space="preserve"> </w:t>
       </w:r>
-      <w:hyperlink r:id="rId43">
+      <w:hyperlink r:id="rId42">
         <w:r>
           <w:rPr>
             <w:rStyle w:val="Hyperlink"/>
@@ -2320,8 +2377,8 @@
       </w:r>
       <w:r>
         <w:rPr>
+          <w:b/>
           <w:bCs/>
-          <w:b/>
         </w:rPr>
         <w:t xml:space="preserve">Onditi, K. O.</w:t>
       </w:r>
@@ -2333,8 +2390,8 @@
       </w:r>
       <w:r>
         <w:rPr>
+          <w:i/>
           <w:iCs/>
-          <w:i/>
         </w:rPr>
         <w:t xml:space="preserve">Ecological Indicators</w:t>
       </w:r>
@@ -2344,7 +2401,7 @@
       <w:r>
         <w:t xml:space="preserve"> </w:t>
       </w:r>
-      <w:hyperlink r:id="rId44">
+      <w:hyperlink r:id="rId43">
         <w:r>
           <w:rPr>
             <w:rStyle w:val="Hyperlink"/>
@@ -2374,8 +2431,8 @@
       </w:r>
       <w:r>
         <w:rPr>
+          <w:b/>
           <w:bCs/>
-          <w:b/>
         </w:rPr>
         <w:t xml:space="preserve">Onditi, K. O.</w:t>
       </w:r>
@@ -2387,8 +2444,8 @@
       </w:r>
       <w:r>
         <w:rPr>
+          <w:i/>
           <w:iCs/>
-          <w:i/>
         </w:rPr>
         <w:t xml:space="preserve">Frontiers in Ecology and Evolution</w:t>
       </w:r>
@@ -2398,7 +2455,7 @@
       <w:r>
         <w:t xml:space="preserve"> </w:t>
       </w:r>
-      <w:hyperlink r:id="rId45">
+      <w:hyperlink r:id="rId44">
         <w:r>
           <w:rPr>
             <w:rStyle w:val="Hyperlink"/>
@@ -2428,8 +2485,8 @@
       </w:r>
       <w:r>
         <w:rPr>
+          <w:b/>
           <w:bCs/>
-          <w:b/>
         </w:rPr>
         <w:t xml:space="preserve">Onditi, K. O.</w:t>
       </w:r>
@@ -2438,21 +2495,21 @@
       </w:r>
       <w:r>
         <w:rPr>
+          <w:i/>
           <w:iCs/>
+        </w:rPr>
+        <w:t xml:space="preserve">Mesechinus</w:t>
+      </w:r>
+      <w:r>
+        <w:t xml:space="preserve">, Erinaceidae, Eulipotyphla, Mammalia) from eastern China.</w:t>
+      </w:r>
+      <w:r>
+        <w:t xml:space="preserve"> </w:t>
+      </w:r>
+      <w:r>
+        <w:rPr>
           <w:i/>
-        </w:rPr>
-        <w:t xml:space="preserve">Mesechinus</w:t>
-      </w:r>
-      <w:r>
-        <w:t xml:space="preserve">, Erinaceidae, Eulipotyphla, Mammalia) from eastern China.</w:t>
-      </w:r>
-      <w:r>
-        <w:t xml:space="preserve"> </w:t>
-      </w:r>
-      <w:r>
-        <w:rPr>
           <w:iCs/>
-          <w:i/>
         </w:rPr>
         <w:t xml:space="preserve">ZooKeys</w:t>
       </w:r>
@@ -2462,7 +2519,7 @@
       <w:r>
         <w:t xml:space="preserve"> </w:t>
       </w:r>
-      <w:hyperlink r:id="rId46">
+      <w:hyperlink r:id="rId45">
         <w:r>
           <w:rPr>
             <w:rStyle w:val="Hyperlink"/>
@@ -2492,8 +2549,8 @@
       </w:r>
       <w:r>
         <w:rPr>
+          <w:b/>
           <w:bCs/>
-          <w:b/>
         </w:rPr>
         <w:t xml:space="preserve">Onditi, K. O.</w:t>
       </w:r>
@@ -2505,8 +2562,8 @@
       </w:r>
       <w:r>
         <w:rPr>
+          <w:i/>
           <w:iCs/>
-          <w:i/>
         </w:rPr>
         <w:t xml:space="preserve">Frontiers in Ecology and Evolution</w:t>
       </w:r>
@@ -2516,7 +2573,7 @@
       <w:r>
         <w:t xml:space="preserve"> </w:t>
       </w:r>
-      <w:hyperlink r:id="rId47">
+      <w:hyperlink r:id="rId46">
         <w:r>
           <w:rPr>
             <w:rStyle w:val="Hyperlink"/>
@@ -2546,8 +2603,8 @@
       </w:r>
       <w:r>
         <w:rPr>
+          <w:b/>
           <w:bCs/>
-          <w:b/>
         </w:rPr>
         <w:t xml:space="preserve">Onditi, K. O.</w:t>
       </w:r>
@@ -2559,8 +2616,8 @@
       </w:r>
       <w:r>
         <w:rPr>
+          <w:i/>
           <w:iCs/>
-          <w:i/>
         </w:rPr>
         <w:t xml:space="preserve">Biodiversity and Conservation</w:t>
       </w:r>
@@ -2570,7 +2627,7 @@
       <w:r>
         <w:t xml:space="preserve"> </w:t>
       </w:r>
-      <w:hyperlink r:id="rId48">
+      <w:hyperlink r:id="rId47">
         <w:r>
           <w:rPr>
             <w:rStyle w:val="Hyperlink"/>
@@ -2600,8 +2657,8 @@
       </w:r>
       <w:r>
         <w:rPr>
+          <w:b/>
           <w:bCs/>
-          <w:b/>
         </w:rPr>
         <w:t xml:space="preserve">Onditi, K. O.</w:t>
       </w:r>
@@ -2616,24 +2673,24 @@
       </w:r>
       <w:r>
         <w:rPr>
+          <w:i/>
           <w:iCs/>
+        </w:rPr>
+        <w:t xml:space="preserve">Chodsigoa</w:t>
+      </w:r>
+      <w:r>
+        <w:t xml:space="preserve"> </w:t>
+      </w:r>
+      <w:r>
+        <w:t xml:space="preserve">(Soricidae, Eulipotyphla, Mammalia) from the Dabie Mountains, Anhui Province, eastern China.</w:t>
+      </w:r>
+      <w:r>
+        <w:t xml:space="preserve"> </w:t>
+      </w:r>
+      <w:r>
+        <w:rPr>
           <w:i/>
-        </w:rPr>
-        <w:t xml:space="preserve">Chodsigoa</w:t>
-      </w:r>
-      <w:r>
-        <w:t xml:space="preserve"> </w:t>
-      </w:r>
-      <w:r>
-        <w:t xml:space="preserve">(Soricidae, Eulipotyphla, Mammalia) from the Dabie Mountains, Anhui Province, eastern China.</w:t>
-      </w:r>
-      <w:r>
-        <w:t xml:space="preserve"> </w:t>
-      </w:r>
-      <w:r>
-        <w:rPr>
           <w:iCs/>
-          <w:i/>
         </w:rPr>
         <w:t xml:space="preserve">ZooKeys</w:t>
       </w:r>
@@ -2643,7 +2700,7 @@
       <w:r>
         <w:t xml:space="preserve"> </w:t>
       </w:r>
-      <w:hyperlink r:id="rId49">
+      <w:hyperlink r:id="rId48">
         <w:r>
           <w:rPr>
             <w:rStyle w:val="Hyperlink"/>
@@ -2673,8 +2730,8 @@
       </w:r>
       <w:r>
         <w:rPr>
+          <w:b/>
           <w:bCs/>
-          <w:b/>
         </w:rPr>
         <w:t xml:space="preserve">Onditi, K. O.</w:t>
       </w:r>
@@ -2683,37 +2740,37 @@
       </w:r>
       <w:r>
         <w:rPr>
+          <w:i/>
           <w:iCs/>
+        </w:rPr>
+        <w:t xml:space="preserve">Chodsigoa hypsibia</w:t>
+      </w:r>
+      <w:r>
+        <w:t xml:space="preserve"> </w:t>
+      </w:r>
+      <w:r>
+        <w:t xml:space="preserve">and</w:t>
+      </w:r>
+      <w:r>
+        <w:t xml:space="preserve"> </w:t>
+      </w:r>
+      <w:r>
+        <w:rPr>
           <w:i/>
-        </w:rPr>
-        <w:t xml:space="preserve">Chodsigoa hypsibia</w:t>
-      </w:r>
-      <w:r>
-        <w:t xml:space="preserve"> </w:t>
-      </w:r>
-      <w:r>
-        <w:t xml:space="preserve">and</w:t>
-      </w:r>
-      <w:r>
-        <w:t xml:space="preserve"> </w:t>
-      </w:r>
-      <w:r>
-        <w:rPr>
           <w:iCs/>
+        </w:rPr>
+        <w:t xml:space="preserve">Anourosorex squamipes</w:t>
+      </w:r>
+      <w:r>
+        <w:t xml:space="preserve">) under climate change in China.</w:t>
+      </w:r>
+      <w:r>
+        <w:t xml:space="preserve"> </w:t>
+      </w:r>
+      <w:r>
+        <w:rPr>
           <w:i/>
-        </w:rPr>
-        <w:t xml:space="preserve">Anourosorex squamipes</w:t>
-      </w:r>
-      <w:r>
-        <w:t xml:space="preserve">) under climate change in China.</w:t>
-      </w:r>
-      <w:r>
-        <w:t xml:space="preserve"> </w:t>
-      </w:r>
-      <w:r>
-        <w:rPr>
           <w:iCs/>
-          <w:i/>
         </w:rPr>
         <w:t xml:space="preserve">Diversity</w:t>
       </w:r>
@@ -2723,7 +2780,7 @@
       <w:r>
         <w:t xml:space="preserve"> </w:t>
       </w:r>
-      <w:hyperlink r:id="rId50">
+      <w:hyperlink r:id="rId49">
         <w:r>
           <w:rPr>
             <w:rStyle w:val="Hyperlink"/>
@@ -2747,8 +2804,8 @@
       </w:r>
       <w:r>
         <w:rPr>
+          <w:b/>
           <w:bCs/>
-          <w:b/>
         </w:rPr>
         <w:t xml:space="preserve">Onditi, K. O.</w:t>
       </w:r>
@@ -2760,8 +2817,8 @@
       </w:r>
       <w:r>
         <w:rPr>
+          <w:i/>
           <w:iCs/>
-          <w:i/>
         </w:rPr>
         <w:t xml:space="preserve">Frontiers in Ecology and Evolution</w:t>
       </w:r>
@@ -2771,7 +2828,7 @@
       <w:r>
         <w:t xml:space="preserve"> </w:t>
       </w:r>
-      <w:hyperlink r:id="rId51">
+      <w:hyperlink r:id="rId50">
         <w:r>
           <w:rPr>
             <w:rStyle w:val="Hyperlink"/>
@@ -2801,8 +2858,8 @@
       </w:r>
       <w:r>
         <w:rPr>
+          <w:b/>
           <w:bCs/>
-          <w:b/>
         </w:rPr>
         <w:t xml:space="preserve">Onditi, K. O.</w:t>
       </w:r>
@@ -2814,8 +2871,8 @@
       </w:r>
       <w:r>
         <w:rPr>
+          <w:i/>
           <w:iCs/>
-          <w:i/>
         </w:rPr>
         <w:t xml:space="preserve">Animals</w:t>
       </w:r>
@@ -2825,7 +2882,7 @@
       <w:r>
         <w:t xml:space="preserve"> </w:t>
       </w:r>
-      <w:hyperlink r:id="rId52">
+      <w:hyperlink r:id="rId51">
         <w:r>
           <w:rPr>
             <w:rStyle w:val="Hyperlink"/>
@@ -2855,8 +2912,8 @@
       </w:r>
       <w:r>
         <w:rPr>
+          <w:b/>
           <w:bCs/>
-          <w:b/>
         </w:rPr>
         <w:t xml:space="preserve">Onditi, K. O.</w:t>
       </w:r>
@@ -2871,8 +2928,8 @@
       </w:r>
       <w:r>
         <w:rPr>
+          <w:i/>
           <w:iCs/>
-          <w:i/>
         </w:rPr>
         <w:t xml:space="preserve">Acta Theriologica Sinica</w:t>
       </w:r>
@@ -2882,7 +2939,7 @@
       <w:r>
         <w:t xml:space="preserve"> </w:t>
       </w:r>
-      <w:hyperlink r:id="rId53">
+      <w:hyperlink r:id="rId52">
         <w:r>
           <w:rPr>
             <w:rStyle w:val="Hyperlink"/>
@@ -2912,8 +2969,8 @@
       </w:r>
       <w:r>
         <w:rPr>
+          <w:b/>
           <w:bCs/>
-          <w:b/>
         </w:rPr>
         <w:t xml:space="preserve">Onditi, K. O.</w:t>
       </w:r>
@@ -2925,8 +2982,8 @@
       </w:r>
       <w:r>
         <w:rPr>
+          <w:i/>
           <w:iCs/>
-          <w:i/>
         </w:rPr>
         <w:t xml:space="preserve">Zoological Journal of the Linnean Society</w:t>
       </w:r>
@@ -2936,7 +2993,7 @@
       <w:r>
         <w:t xml:space="preserve"> </w:t>
       </w:r>
-      <w:hyperlink r:id="rId54">
+      <w:hyperlink r:id="rId53">
         <w:r>
           <w:rPr>
             <w:rStyle w:val="Hyperlink"/>
@@ -2960,8 +3017,8 @@
       </w:r>
       <w:r>
         <w:rPr>
+          <w:b/>
           <w:bCs/>
-          <w:b/>
         </w:rPr>
         <w:t xml:space="preserve">Onditi, K. O.</w:t>
       </w:r>
@@ -2973,8 +3030,8 @@
       </w:r>
       <w:r>
         <w:rPr>
+          <w:i/>
           <w:iCs/>
-          <w:i/>
         </w:rPr>
         <w:t xml:space="preserve">Biodiversity and Conservation</w:t>
       </w:r>
@@ -2984,7 +3041,7 @@
       <w:r>
         <w:t xml:space="preserve"> </w:t>
       </w:r>
-      <w:hyperlink r:id="rId55">
+      <w:hyperlink r:id="rId54">
         <w:r>
           <w:rPr>
             <w:rStyle w:val="Hyperlink"/>
@@ -3008,8 +3065,8 @@
       </w:r>
       <w:r>
         <w:rPr>
+          <w:b/>
           <w:bCs/>
-          <w:b/>
         </w:rPr>
         <w:t xml:space="preserve">Onditi, K. O.</w:t>
       </w:r>
@@ -3018,24 +3075,24 @@
       </w:r>
       <w:r>
         <w:rPr>
+          <w:i/>
           <w:iCs/>
+        </w:rPr>
+        <w:t xml:space="preserve">Lophuromys flavopunctatus</w:t>
+      </w:r>
+      <w:r>
+        <w:t xml:space="preserve"> </w:t>
+      </w:r>
+      <w:r>
+        <w:t xml:space="preserve">group).</w:t>
+      </w:r>
+      <w:r>
+        <w:t xml:space="preserve"> </w:t>
+      </w:r>
+      <w:r>
+        <w:rPr>
           <w:i/>
-        </w:rPr>
-        <w:t xml:space="preserve">Lophuromys flavopunctatus</w:t>
-      </w:r>
-      <w:r>
-        <w:t xml:space="preserve"> </w:t>
-      </w:r>
-      <w:r>
-        <w:t xml:space="preserve">group).</w:t>
-      </w:r>
-      <w:r>
-        <w:t xml:space="preserve"> </w:t>
-      </w:r>
-      <w:r>
-        <w:rPr>
           <w:iCs/>
-          <w:i/>
         </w:rPr>
         <w:t xml:space="preserve">BMC Ecology and Evolution</w:t>
       </w:r>
@@ -3045,7 +3102,7 @@
       <w:r>
         <w:t xml:space="preserve"> </w:t>
       </w:r>
-      <w:hyperlink r:id="rId56">
+      <w:hyperlink r:id="rId55">
         <w:r>
           <w:rPr>
             <w:rStyle w:val="Hyperlink"/>
@@ -3075,8 +3132,8 @@
       </w:r>
       <w:r>
         <w:rPr>
+          <w:b/>
           <w:bCs/>
-          <w:b/>
         </w:rPr>
         <w:t xml:space="preserve">Onditi, K. O.</w:t>
       </w:r>
@@ -3088,8 +3145,8 @@
       </w:r>
       <w:r>
         <w:rPr>
+          <w:i/>
           <w:iCs/>
-          <w:i/>
         </w:rPr>
         <w:t xml:space="preserve">Ecology and Evolution</w:t>
       </w:r>
@@ -3099,7 +3156,7 @@
       <w:r>
         <w:t xml:space="preserve"> </w:t>
       </w:r>
-      <w:hyperlink r:id="rId57">
+      <w:hyperlink r:id="rId56">
         <w:r>
           <w:rPr>
             <w:rStyle w:val="Hyperlink"/>
@@ -3123,8 +3180,8 @@
       </w:r>
       <w:r>
         <w:rPr>
+          <w:b/>
           <w:bCs/>
-          <w:b/>
         </w:rPr>
         <w:t xml:space="preserve">Onditi, K. O.</w:t>
       </w:r>
@@ -3133,24 +3190,24 @@
       </w:r>
       <w:r>
         <w:rPr>
+          <w:i/>
           <w:iCs/>
+        </w:rPr>
+        <w:t xml:space="preserve">Lophuromys</w:t>
+      </w:r>
+      <w:r>
+        <w:t xml:space="preserve"> </w:t>
+      </w:r>
+      <w:r>
+        <w:t xml:space="preserve">Peters 1874); relevance to taxonomy and ecology.</w:t>
+      </w:r>
+      <w:r>
+        <w:t xml:space="preserve"> </w:t>
+      </w:r>
+      <w:r>
+        <w:rPr>
           <w:i/>
-        </w:rPr>
-        <w:t xml:space="preserve">Lophuromys</w:t>
-      </w:r>
-      <w:r>
-        <w:t xml:space="preserve"> </w:t>
-      </w:r>
-      <w:r>
-        <w:t xml:space="preserve">Peters 1874); relevance to taxonomy and ecology.</w:t>
-      </w:r>
-      <w:r>
-        <w:t xml:space="preserve"> </w:t>
-      </w:r>
-      <w:r>
-        <w:rPr>
           <w:iCs/>
-          <w:i/>
         </w:rPr>
         <w:t xml:space="preserve">Mammal Research</w:t>
       </w:r>
@@ -3160,7 +3217,7 @@
       <w:r>
         <w:t xml:space="preserve"> </w:t>
       </w:r>
-      <w:hyperlink r:id="rId58">
+      <w:hyperlink r:id="rId57">
         <w:r>
           <w:rPr>
             <w:rStyle w:val="Hyperlink"/>
@@ -3190,8 +3247,8 @@
       </w:r>
       <w:r>
         <w:rPr>
+          <w:b/>
           <w:bCs/>
-          <w:b/>
         </w:rPr>
         <w:t xml:space="preserve">Onditi, K. O.</w:t>
       </w:r>
@@ -3203,8 +3260,8 @@
       </w:r>
       <w:r>
         <w:rPr>
+          <w:i/>
           <w:iCs/>
-          <w:i/>
         </w:rPr>
         <w:t xml:space="preserve">Zoological Research</w:t>
       </w:r>
@@ -3214,7 +3271,7 @@
       <w:r>
         <w:t xml:space="preserve"> </w:t>
       </w:r>
-      <w:hyperlink r:id="rId59">
+      <w:hyperlink r:id="rId58">
         <w:r>
           <w:rPr>
             <w:rStyle w:val="Hyperlink"/>
@@ -3244,8 +3301,8 @@
       </w:r>
       <w:r>
         <w:rPr>
+          <w:b/>
           <w:bCs/>
-          <w:b/>
         </w:rPr>
         <w:t xml:space="preserve">Onditi, K. O.</w:t>
       </w:r>
@@ -3257,8 +3314,8 @@
       </w:r>
       <w:r>
         <w:rPr>
+          <w:i/>
           <w:iCs/>
-          <w:i/>
         </w:rPr>
         <w:t xml:space="preserve">Zoological Research</w:t>
       </w:r>
@@ -3268,7 +3325,7 @@
       <w:r>
         <w:t xml:space="preserve"> </w:t>
       </w:r>
-      <w:hyperlink r:id="rId60">
+      <w:hyperlink r:id="rId59">
         <w:r>
           <w:rPr>
             <w:rStyle w:val="Hyperlink"/>
@@ -3306,8 +3363,8 @@
       </w:r>
       <w:r>
         <w:rPr>
+          <w:b/>
           <w:bCs/>
-          <w:b/>
         </w:rPr>
         <w:t xml:space="preserve">Onditi, K. O.</w:t>
       </w:r>
@@ -3319,8 +3376,8 @@
       </w:r>
       <w:r>
         <w:rPr>
+          <w:i/>
           <w:iCs/>
-          <w:i/>
         </w:rPr>
         <w:t xml:space="preserve">SSRN</w:t>
       </w:r>
@@ -3333,7 +3390,7 @@
       <w:r>
         <w:t xml:space="preserve"> </w:t>
       </w:r>
-      <w:hyperlink r:id="rId61">
+      <w:hyperlink r:id="rId60">
         <w:r>
           <w:rPr>
             <w:rStyle w:val="Hyperlink"/>
@@ -3363,8 +3420,8 @@
       </w:r>
       <w:r>
         <w:rPr>
+          <w:b/>
           <w:bCs/>
-          <w:b/>
         </w:rPr>
         <w:t xml:space="preserve">Onditi, K. O.</w:t>
       </w:r>
@@ -3376,8 +3433,8 @@
       </w:r>
       <w:r>
         <w:rPr>
+          <w:i/>
           <w:iCs/>
-          <w:i/>
         </w:rPr>
         <w:t xml:space="preserve">Research Square</w:t>
       </w:r>
@@ -3390,7 +3447,7 @@
       <w:r>
         <w:t xml:space="preserve"> </w:t>
       </w:r>
-      <w:hyperlink r:id="rId62">
+      <w:hyperlink r:id="rId61">
         <w:r>
           <w:rPr>
             <w:rStyle w:val="Hyperlink"/>
@@ -3562,8 +3619,8 @@
       </w:r>
       <w:r>
         <w:rPr>
+          <w:i/>
           <w:iCs/>
-          <w:i/>
         </w:rPr>
         <w:t xml:space="preserve">Lophuromys aquilus</w:t>
       </w:r>
@@ -3609,8 +3666,8 @@
       </w:r>
       <w:r>
         <w:rPr>
+          <w:i/>
           <w:iCs/>
-          <w:i/>
         </w:rPr>
         <w:t xml:space="preserve">Lophuromys aquilus</w:t>
       </w:r>
@@ -3925,27 +3982,27 @@
       </w:r>
       <w:r>
         <w:rPr>
+          <w:i/>
           <w:iCs/>
+        </w:rPr>
+        <w:t xml:space="preserve">Lemniscomys</w:t>
+      </w:r>
+      <w:r>
+        <w:t xml:space="preserve">). First-author</w:t>
+      </w:r>
+      <w:r>
+        <w:t xml:space="preserve"> </w:t>
+      </w:r>
+      <w:r>
+        <w:t xml:space="preserve">article: Sambaya et al. (2025),</w:t>
+      </w:r>
+      <w:r>
+        <w:t xml:space="preserve"> </w:t>
+      </w:r>
+      <w:r>
+        <w:rPr>
           <w:i/>
-        </w:rPr>
-        <w:t xml:space="preserve">Lemniscomys</w:t>
-      </w:r>
-      <w:r>
-        <w:t xml:space="preserve">). First-author</w:t>
-      </w:r>
-      <w:r>
-        <w:t xml:space="preserve"> </w:t>
-      </w:r>
-      <w:r>
-        <w:t xml:space="preserve">article: Sambaya et al. (2025),</w:t>
-      </w:r>
-      <w:r>
-        <w:t xml:space="preserve"> </w:t>
-      </w:r>
-      <w:r>
-        <w:rPr>
           <w:iCs/>
-          <w:i/>
         </w:rPr>
         <w:t xml:space="preserve">Zoological Research: Diversity and Conservation</w:t>
       </w:r>
@@ -3994,8 +4051,8 @@
       </w:r>
       <w:r>
         <w:rPr>
+          <w:i/>
           <w:iCs/>
-          <w:i/>
         </w:rPr>
         <w:t xml:space="preserve">Life</w:t>
       </w:r>
@@ -4642,14 +4699,14 @@
     </w:lvl>
   </w:abstractNum>
   <w:abstractNum w:abstractNumId="990">
-    <w:nsid w:val="A990"/>
+    <w:nsid w:val="0000A990"/>
     <w:multiLevelType w:val="multilevel"/>
     <w:lvl w:ilvl="0">
       <w:numFmt w:val="bullet"/>
       <w:lvlText w:val=" "/>
       <w:lvlJc w:val="left"/>
       <w:pPr>
-        <w:ind w:left="720" w:hanging="480"/>
+        <w:ind w:left="720" w:hanging="360"/>
       </w:pPr>
     </w:lvl>
     <w:lvl w:ilvl="1">
@@ -4657,7 +4714,7 @@
       <w:lvlText w:val=" "/>
       <w:lvlJc w:val="left"/>
       <w:pPr>
-        <w:ind w:left="1440" w:hanging="480"/>
+        <w:ind w:left="1440" w:hanging="360"/>
       </w:pPr>
     </w:lvl>
     <w:lvl w:ilvl="2">
@@ -4665,7 +4722,7 @@
       <w:lvlText w:val=" "/>
       <w:lvlJc w:val="left"/>
       <w:pPr>
-        <w:ind w:left="2160" w:hanging="480"/>
+        <w:ind w:left="2160" w:hanging="360"/>
       </w:pPr>
     </w:lvl>
     <w:lvl w:ilvl="3">
@@ -4673,7 +4730,7 @@
       <w:lvlText w:val=" "/>
       <w:lvlJc w:val="left"/>
       <w:pPr>
-        <w:ind w:left="2880" w:hanging="480"/>
+        <w:ind w:left="2880" w:hanging="360"/>
       </w:pPr>
     </w:lvl>
     <w:lvl w:ilvl="4">
@@ -4681,7 +4738,7 @@
       <w:lvlText w:val=" "/>
       <w:lvlJc w:val="left"/>
       <w:pPr>
-        <w:ind w:left="3600" w:hanging="480"/>
+        <w:ind w:left="3600" w:hanging="360"/>
       </w:pPr>
     </w:lvl>
     <w:lvl w:ilvl="5">
@@ -4689,7 +4746,7 @@
       <w:lvlText w:val=" "/>
       <w:lvlJc w:val="left"/>
       <w:pPr>
-        <w:ind w:left="4320" w:hanging="480"/>
+        <w:ind w:left="4320" w:hanging="360"/>
       </w:pPr>
     </w:lvl>
     <w:lvl w:ilvl="6">
@@ -4697,7 +4754,7 @@
       <w:lvlText w:val=" "/>
       <w:lvlJc w:val="left"/>
       <w:pPr>
-        <w:ind w:left="5040" w:hanging="480"/>
+        <w:ind w:left="5040" w:hanging="360"/>
       </w:pPr>
     </w:lvl>
     <w:lvl w:ilvl="7">
@@ -4705,7 +4762,7 @@
       <w:lvlText w:val=" "/>
       <w:lvlJc w:val="left"/>
       <w:pPr>
-        <w:ind w:left="5760" w:hanging="480"/>
+        <w:ind w:left="5760" w:hanging="360"/>
       </w:pPr>
     </w:lvl>
     <w:lvl w:ilvl="8">
@@ -4713,7 +4770,7 @@
       <w:lvlText w:val=" "/>
       <w:lvlJc w:val="left"/>
       <w:pPr>
-        <w:ind w:left="6480" w:hanging="480"/>
+        <w:ind w:left="6480" w:hanging="360"/>
       </w:pPr>
     </w:lvl>
   </w:abstractNum>
@@ -17088,233 +17145,261 @@
     <w:link w:val="VerbatimChar"/>
     <w:pPr>
       <w:wordWrap w:val="off"/>
+      <w:shd w:val="clear" w:fill="f1f3f5"/>
     </w:pPr>
   </w:style>
   <w:style w:type="character" w:customStyle="1" w:styleId="KeywordTok">
     <w:name w:val="KeywordTok"/>
     <w:basedOn w:val="VerbatimChar"/>
     <w:rPr>
-      <w:color w:val="007020"/>
       <w:b/>
+      <w:color w:val="003b4f"/>
+      <w:shd w:val="clear" w:fill="f1f3f5"/>
     </w:rPr>
   </w:style>
   <w:style w:type="character" w:customStyle="1" w:styleId="DataTypeTok">
     <w:name w:val="DataTypeTok"/>
     <w:basedOn w:val="VerbatimChar"/>
     <w:rPr>
-      <w:color w:val="902000"/>
+      <w:color w:val="ad0000"/>
+      <w:shd w:val="clear" w:fill="f1f3f5"/>
     </w:rPr>
   </w:style>
   <w:style w:type="character" w:customStyle="1" w:styleId="DecValTok">
     <w:name w:val="DecValTok"/>
     <w:basedOn w:val="VerbatimChar"/>
     <w:rPr>
-      <w:color w:val="40a070"/>
+      <w:color w:val="ad0000"/>
+      <w:shd w:val="clear" w:fill="f1f3f5"/>
     </w:rPr>
   </w:style>
   <w:style w:type="character" w:customStyle="1" w:styleId="BaseNTok">
     <w:name w:val="BaseNTok"/>
     <w:basedOn w:val="VerbatimChar"/>
     <w:rPr>
-      <w:color w:val="40a070"/>
+      <w:color w:val="ad0000"/>
+      <w:shd w:val="clear" w:fill="f1f3f5"/>
     </w:rPr>
   </w:style>
   <w:style w:type="character" w:customStyle="1" w:styleId="FloatTok">
     <w:name w:val="FloatTok"/>
     <w:basedOn w:val="VerbatimChar"/>
     <w:rPr>
-      <w:color w:val="40a070"/>
+      <w:color w:val="ad0000"/>
+      <w:shd w:val="clear" w:fill="f1f3f5"/>
     </w:rPr>
   </w:style>
   <w:style w:type="character" w:customStyle="1" w:styleId="ConstantTok">
     <w:name w:val="ConstantTok"/>
     <w:basedOn w:val="VerbatimChar"/>
     <w:rPr>
-      <w:color w:val="880000"/>
+      <w:color w:val="8f5902"/>
+      <w:shd w:val="clear" w:fill="f1f3f5"/>
     </w:rPr>
   </w:style>
   <w:style w:type="character" w:customStyle="1" w:styleId="CharTok">
     <w:name w:val="CharTok"/>
     <w:basedOn w:val="VerbatimChar"/>
     <w:rPr>
-      <w:color w:val="4070a0"/>
+      <w:color w:val="20794d"/>
+      <w:shd w:val="clear" w:fill="f1f3f5"/>
     </w:rPr>
   </w:style>
   <w:style w:type="character" w:customStyle="1" w:styleId="SpecialCharTok">
     <w:name w:val="SpecialCharTok"/>
     <w:basedOn w:val="VerbatimChar"/>
     <w:rPr>
-      <w:color w:val="4070a0"/>
+      <w:color w:val="5e5e5e"/>
+      <w:shd w:val="clear" w:fill="f1f3f5"/>
     </w:rPr>
   </w:style>
   <w:style w:type="character" w:customStyle="1" w:styleId="StringTok">
     <w:name w:val="StringTok"/>
     <w:basedOn w:val="VerbatimChar"/>
     <w:rPr>
-      <w:color w:val="4070a0"/>
+      <w:color w:val="20794d"/>
+      <w:shd w:val="clear" w:fill="f1f3f5"/>
     </w:rPr>
   </w:style>
   <w:style w:type="character" w:customStyle="1" w:styleId="VerbatimStringTok">
     <w:name w:val="VerbatimStringTok"/>
     <w:basedOn w:val="VerbatimChar"/>
     <w:rPr>
-      <w:color w:val="4070a0"/>
+      <w:color w:val="20794d"/>
+      <w:shd w:val="clear" w:fill="f1f3f5"/>
     </w:rPr>
   </w:style>
   <w:style w:type="character" w:customStyle="1" w:styleId="SpecialStringTok">
     <w:name w:val="SpecialStringTok"/>
     <w:basedOn w:val="VerbatimChar"/>
     <w:rPr>
-      <w:color w:val="bb6688"/>
+      <w:color w:val="20794d"/>
+      <w:shd w:val="clear" w:fill="f1f3f5"/>
     </w:rPr>
   </w:style>
   <w:style w:type="character" w:customStyle="1" w:styleId="ImportTok">
     <w:name w:val="ImportTok"/>
     <w:basedOn w:val="VerbatimChar"/>
     <w:rPr>
-      <w:color w:val="008000"/>
-      <w:b/>
+      <w:color w:val="00769e"/>
+      <w:shd w:val="clear" w:fill="f1f3f5"/>
     </w:rPr>
   </w:style>
   <w:style w:type="character" w:customStyle="1" w:styleId="CommentTok">
     <w:name w:val="CommentTok"/>
     <w:basedOn w:val="VerbatimChar"/>
     <w:rPr>
-      <w:color w:val="60a0b0"/>
-      <w:i/>
+      <w:color w:val="5e5e5e"/>
+      <w:shd w:val="clear" w:fill="f1f3f5"/>
     </w:rPr>
   </w:style>
   <w:style w:type="character" w:customStyle="1" w:styleId="DocumentationTok">
     <w:name w:val="DocumentationTok"/>
     <w:basedOn w:val="VerbatimChar"/>
     <w:rPr>
-      <w:color w:val="ba2121"/>
       <w:i/>
+      <w:color w:val="5e5e5e"/>
+      <w:shd w:val="clear" w:fill="f1f3f5"/>
     </w:rPr>
   </w:style>
   <w:style w:type="character" w:customStyle="1" w:styleId="AnnotationTok">
     <w:name w:val="AnnotationTok"/>
     <w:basedOn w:val="VerbatimChar"/>
     <w:rPr>
-      <w:color w:val="60a0b0"/>
-      <w:b/>
-      <w:i/>
+      <w:color w:val="5e5e5e"/>
+      <w:shd w:val="clear" w:fill="f1f3f5"/>
     </w:rPr>
   </w:style>
   <w:style w:type="character" w:customStyle="1" w:styleId="CommentVarTok">
     <w:name w:val="CommentVarTok"/>
     <w:basedOn w:val="VerbatimChar"/>
     <w:rPr>
-      <w:color w:val="60a0b0"/>
-      <w:b/>
       <w:i/>
+      <w:color w:val="5e5e5e"/>
+      <w:shd w:val="clear" w:fill="f1f3f5"/>
     </w:rPr>
   </w:style>
   <w:style w:type="character" w:customStyle="1" w:styleId="OtherTok">
     <w:name w:val="OtherTok"/>
     <w:basedOn w:val="VerbatimChar"/>
     <w:rPr>
-      <w:color w:val="007020"/>
+      <w:color w:val="003b4f"/>
+      <w:shd w:val="clear" w:fill="f1f3f5"/>
     </w:rPr>
   </w:style>
   <w:style w:type="character" w:customStyle="1" w:styleId="FunctionTok">
     <w:name w:val="FunctionTok"/>
     <w:basedOn w:val="VerbatimChar"/>
     <w:rPr>
-      <w:color w:val="06287e"/>
+      <w:color w:val="4758ab"/>
+      <w:shd w:val="clear" w:fill="f1f3f5"/>
     </w:rPr>
   </w:style>
   <w:style w:type="character" w:customStyle="1" w:styleId="VariableTok">
     <w:name w:val="VariableTok"/>
     <w:basedOn w:val="VerbatimChar"/>
     <w:rPr>
-      <w:color w:val="19177c"/>
+      <w:color w:val="111111"/>
+      <w:shd w:val="clear" w:fill="f1f3f5"/>
     </w:rPr>
   </w:style>
   <w:style w:type="character" w:customStyle="1" w:styleId="ControlFlowTok">
     <w:name w:val="ControlFlowTok"/>
     <w:basedOn w:val="VerbatimChar"/>
     <w:rPr>
-      <w:color w:val="007020"/>
       <w:b/>
+      <w:color w:val="003b4f"/>
+      <w:shd w:val="clear" w:fill="f1f3f5"/>
     </w:rPr>
   </w:style>
   <w:style w:type="character" w:customStyle="1" w:styleId="OperatorTok">
     <w:name w:val="OperatorTok"/>
     <w:basedOn w:val="VerbatimChar"/>
     <w:rPr>
-      <w:color w:val="666666"/>
+      <w:color w:val="5e5e5e"/>
+      <w:shd w:val="clear" w:fill="f1f3f5"/>
     </w:rPr>
   </w:style>
   <w:style w:type="character" w:customStyle="1" w:styleId="BuiltInTok">
     <w:name w:val="BuiltInTok"/>
     <w:basedOn w:val="VerbatimChar"/>
     <w:rPr>
-      <w:color w:val="008000"/>
+      <w:color w:val="003b4f"/>
+      <w:shd w:val="clear" w:fill="f1f3f5"/>
     </w:rPr>
   </w:style>
   <w:style w:type="character" w:customStyle="1" w:styleId="ExtensionTok">
     <w:name w:val="ExtensionTok"/>
     <w:basedOn w:val="VerbatimChar"/>
-    <w:rPr/>
+    <w:rPr>
+      <w:color w:val="003b4f"/>
+      <w:shd w:val="clear" w:fill="f1f3f5"/>
+    </w:rPr>
   </w:style>
   <w:style w:type="character" w:customStyle="1" w:styleId="PreprocessorTok">
     <w:name w:val="PreprocessorTok"/>
     <w:basedOn w:val="VerbatimChar"/>
     <w:rPr>
-      <w:color w:val="bc7a00"/>
+      <w:color w:val="ad0000"/>
+      <w:shd w:val="clear" w:fill="f1f3f5"/>
     </w:rPr>
   </w:style>
   <w:style w:type="character" w:customStyle="1" w:styleId="AttributeTok">
     <w:name w:val="AttributeTok"/>
     <w:basedOn w:val="VerbatimChar"/>
     <w:rPr>
-      <w:color w:val="7d9029"/>
+      <w:color w:val="657422"/>
+      <w:shd w:val="clear" w:fill="f1f3f5"/>
     </w:rPr>
   </w:style>
   <w:style w:type="character" w:customStyle="1" w:styleId="RegionMarkerTok">
     <w:name w:val="RegionMarkerTok"/>
     <w:basedOn w:val="VerbatimChar"/>
-    <w:rPr/>
+    <w:rPr>
+      <w:color w:val="003b4f"/>
+      <w:shd w:val="clear" w:fill="f1f3f5"/>
+    </w:rPr>
   </w:style>
   <w:style w:type="character" w:customStyle="1" w:styleId="InformationTok">
     <w:name w:val="InformationTok"/>
     <w:basedOn w:val="VerbatimChar"/>
     <w:rPr>
-      <w:color w:val="60a0b0"/>
-      <w:b/>
-      <w:i/>
+      <w:color w:val="5e5e5e"/>
+      <w:shd w:val="clear" w:fill="f1f3f5"/>
     </w:rPr>
   </w:style>
   <w:style w:type="character" w:customStyle="1" w:styleId="WarningTok">
     <w:name w:val="WarningTok"/>
     <w:basedOn w:val="VerbatimChar"/>
     <w:rPr>
-      <w:color w:val="60a0b0"/>
-      <w:b/>
       <w:i/>
+      <w:color w:val="5e5e5e"/>
+      <w:shd w:val="clear" w:fill="f1f3f5"/>
     </w:rPr>
   </w:style>
   <w:style w:type="character" w:customStyle="1" w:styleId="AlertTok">
     <w:name w:val="AlertTok"/>
     <w:basedOn w:val="VerbatimChar"/>
     <w:rPr>
-      <w:color w:val="ff0000"/>
-      <w:b/>
+      <w:color w:val="ad0000"/>
+      <w:shd w:val="clear" w:fill="f1f3f5"/>
     </w:rPr>
   </w:style>
   <w:style w:type="character" w:customStyle="1" w:styleId="ErrorTok">
     <w:name w:val="ErrorTok"/>
     <w:basedOn w:val="VerbatimChar"/>
     <w:rPr>
-      <w:color w:val="ff0000"/>
-      <w:b/>
+      <w:color w:val="ad0000"/>
+      <w:shd w:val="clear" w:fill="f1f3f5"/>
     </w:rPr>
   </w:style>
   <w:style w:type="character" w:customStyle="1" w:styleId="NormalTok">
     <w:name w:val="NormalTok"/>
     <w:basedOn w:val="VerbatimChar"/>
-    <w:rPr/>
+    <w:rPr>
+      <w:color w:val="003b4f"/>
+      <w:shd w:val="clear" w:fill="f1f3f5"/>
+    </w:rPr>
   </w:style>
 </w:styles>
 </file>

</xml_diff>

<commit_message>
Refresh Nectogale metadata and repair publication trackers
</commit_message>
<xml_diff>
--- a/cv/OKOnditi_CV_2026.docx
+++ b/cv/OKOnditi_CV_2026.docx
@@ -274,7 +274,7 @@
                 <w:color w:val="8A6520"/>
                 <w:sz w:val="34"/>
               </w:rPr>
-              <w:t xml:space="preserve">403</w:t>
+              <w:t xml:space="preserve">414</w:t>
             </w:r>
           </w:p>
           <w:p>
@@ -428,7 +428,7 @@
         <w:pStyle w:val="CVNote"/>
       </w:pPr>
       <w:r>
-        <w:t xml:space="preserve">Citation figures: Google Scholar, 4 October 2026. Review records: ORCID, 4 October 2026. Articles: publication list below (1 in press).</w:t>
+        <w:t xml:space="preserve">Citation figures: Google Scholar, 16 October 2026. Review records: ORCID, 16 October 2026. Articles: publication list below (1 in press).</w:t>
       </w:r>
     </w:p>
     <w:p>
@@ -1094,7 +1094,7 @@
         <w:tab/>
       </w:r>
       <w:r>
-        <w:t xml:space="preserve">Chen, Z. Z., Shen, Y. C., Zhang, M., Pei, X. X., Xu, Y. F., Song, W. Y., Zhu, Z. X.,</w:t>
+        <w:t xml:space="preserve">Pei, X., Li, Y.,</w:t>
       </w:r>
       <w:r>
         <w:t xml:space="preserve"> </w:t>
@@ -1107,10 +1107,7 @@
         <w:t xml:space="preserve">Onditi, K. O.</w:t>
       </w:r>
       <w:r>
-        <w:t xml:space="preserve"> </w:t>
-      </w:r>
-      <w:r>
-        <w:t xml:space="preserve">&amp; Jiang, X. L. (2026). Systematic revision and species diversification of the genus</w:t>
+        <w:t xml:space="preserve">, Wang, H., Qin, W., Zhu, R., Li, Q., Song, W., Li, X., Zhu, Z., Chen, Z. &amp; Jiang, X. (2027). Phylogeny and evolutionary history of the genus</w:t>
       </w:r>
       <w:r>
         <w:t xml:space="preserve"> </w:t>
@@ -1120,13 +1117,13 @@
           <w:i/>
           <w:iCs/>
         </w:rPr>
-        <w:t xml:space="preserve">Episoriculus</w:t>
-      </w:r>
-      <w:r>
-        <w:t xml:space="preserve"> </w:t>
-      </w:r>
-      <w:r>
-        <w:t xml:space="preserve">(Mammalia: Eulipotyphla: Soricidae), with descriptions of two new species.</w:t>
+        <w:t xml:space="preserve">Nectogale</w:t>
+      </w:r>
+      <w:r>
+        <w:t xml:space="preserve"> </w:t>
+      </w:r>
+      <w:r>
+        <w:t xml:space="preserve">(Soricidae) inferred from whole–genome analyses, with description of a new species endemic to the Himalayas.</w:t>
       </w:r>
       <w:r>
         <w:t xml:space="preserve"> </w:t>
@@ -1136,6 +1133,79 @@
           <w:i/>
           <w:iCs/>
         </w:rPr>
+        <w:t xml:space="preserve">Molecular Phylogenetics and Evolution</w:t>
+      </w:r>
+      <w:r>
+        <w:t xml:space="preserve">, 226, 108749.</w:t>
+      </w:r>
+      <w:r>
+        <w:t xml:space="preserve"> </w:t>
+      </w:r>
+      <w:hyperlink r:id="rId21">
+        <w:r>
+          <w:rPr>
+            <w:rStyle w:val="Hyperlink"/>
+          </w:rPr>
+          <w:t xml:space="preserve">doi:10.1016/j.ympev.2026.108749</w:t>
+        </w:r>
+      </w:hyperlink>
+    </w:p>
+    <w:p>
+      <w:pPr>
+        <w:pStyle w:val="CVPub"/>
+      </w:pPr>
+      <w:r>
+        <w:rPr>
+          <w:rStyle w:val="CVNum"/>
+        </w:rPr>
+        <w:t xml:space="preserve">38.</w:t>
+      </w:r>
+      <w:r>
+        <w:tab/>
+      </w:r>
+      <w:r>
+        <w:t xml:space="preserve">Chen, Z. Z., Shen, Y. C., Zhang, M., Pei, X. X., Xu, Y. F., Song, W. Y., Zhu, Z. X.,</w:t>
+      </w:r>
+      <w:r>
+        <w:t xml:space="preserve"> </w:t>
+      </w:r>
+      <w:r>
+        <w:rPr>
+          <w:b/>
+          <w:bCs/>
+        </w:rPr>
+        <w:t xml:space="preserve">Onditi, K. O.</w:t>
+      </w:r>
+      <w:r>
+        <w:t xml:space="preserve"> </w:t>
+      </w:r>
+      <w:r>
+        <w:t xml:space="preserve">&amp; Jiang, X. L. (2026). Systematic revision and species diversification of the genus</w:t>
+      </w:r>
+      <w:r>
+        <w:t xml:space="preserve"> </w:t>
+      </w:r>
+      <w:r>
+        <w:rPr>
+          <w:i/>
+          <w:iCs/>
+        </w:rPr>
+        <w:t xml:space="preserve">Episoriculus</w:t>
+      </w:r>
+      <w:r>
+        <w:t xml:space="preserve"> </w:t>
+      </w:r>
+      <w:r>
+        <w:t xml:space="preserve">(Mammalia: Eulipotyphla: Soricidae), with descriptions of two new species.</w:t>
+      </w:r>
+      <w:r>
+        <w:t xml:space="preserve"> </w:t>
+      </w:r>
+      <w:r>
+        <w:rPr>
+          <w:i/>
+          <w:iCs/>
+        </w:rPr>
         <w:t xml:space="preserve">Zoological Research</w:t>
       </w:r>
       <w:r>
@@ -1144,7 +1214,7 @@
       <w:r>
         <w:t xml:space="preserve"> </w:t>
       </w:r>
-      <w:hyperlink r:id="rId21">
+      <w:hyperlink r:id="rId22">
         <w:r>
           <w:rPr>
             <w:rStyle w:val="Hyperlink"/>
@@ -1161,7 +1231,7 @@
         <w:rPr>
           <w:rStyle w:val="CVNum"/>
         </w:rPr>
-        <w:t xml:space="preserve">38.</w:t>
+        <w:t xml:space="preserve">37.</w:t>
       </w:r>
       <w:r>
         <w:tab/>
@@ -1198,7 +1268,7 @@
       <w:r>
         <w:t xml:space="preserve"> </w:t>
       </w:r>
-      <w:hyperlink r:id="rId22">
+      <w:hyperlink r:id="rId23">
         <w:r>
           <w:rPr>
             <w:rStyle w:val="Hyperlink"/>
@@ -1215,7 +1285,7 @@
         <w:rPr>
           <w:rStyle w:val="CVNum"/>
         </w:rPr>
-        <w:t xml:space="preserve">37.</w:t>
+        <w:t xml:space="preserve">36.</w:t>
       </w:r>
       <w:r>
         <w:tab/>
@@ -1252,7 +1322,7 @@
       <w:r>
         <w:t xml:space="preserve"> </w:t>
       </w:r>
-      <w:hyperlink r:id="rId23">
+      <w:hyperlink r:id="rId24">
         <w:r>
           <w:rPr>
             <w:rStyle w:val="Hyperlink"/>
@@ -1269,7 +1339,7 @@
         <w:rPr>
           <w:rStyle w:val="CVNum"/>
         </w:rPr>
-        <w:t xml:space="preserve">36.</w:t>
+        <w:t xml:space="preserve">35.</w:t>
       </w:r>
       <w:r>
         <w:tab/>
@@ -1306,7 +1376,7 @@
       <w:r>
         <w:t xml:space="preserve"> </w:t>
       </w:r>
-      <w:hyperlink r:id="rId24">
+      <w:hyperlink r:id="rId25">
         <w:r>
           <w:rPr>
             <w:rStyle w:val="Hyperlink"/>
@@ -1323,7 +1393,7 @@
         <w:rPr>
           <w:rStyle w:val="CVNum"/>
         </w:rPr>
-        <w:t xml:space="preserve">35.</w:t>
+        <w:t xml:space="preserve">34.</w:t>
       </w:r>
       <w:r>
         <w:tab/>
@@ -1360,7 +1430,7 @@
       <w:r>
         <w:t xml:space="preserve"> </w:t>
       </w:r>
-      <w:hyperlink r:id="rId25">
+      <w:hyperlink r:id="rId26">
         <w:r>
           <w:rPr>
             <w:rStyle w:val="Hyperlink"/>
@@ -1377,7 +1447,7 @@
         <w:rPr>
           <w:rStyle w:val="CVNum"/>
         </w:rPr>
-        <w:t xml:space="preserve">34.</w:t>
+        <w:t xml:space="preserve">33.</w:t>
       </w:r>
       <w:r>
         <w:tab/>
@@ -1430,7 +1500,7 @@
       <w:r>
         <w:t xml:space="preserve"> </w:t>
       </w:r>
-      <w:hyperlink r:id="rId26">
+      <w:hyperlink r:id="rId27">
         <w:r>
           <w:rPr>
             <w:rStyle w:val="Hyperlink"/>
@@ -1447,7 +1517,7 @@
         <w:rPr>
           <w:rStyle w:val="CVNum"/>
         </w:rPr>
-        <w:t xml:space="preserve">33.</w:t>
+        <w:t xml:space="preserve">32.</w:t>
       </w:r>
       <w:r>
         <w:tab/>
@@ -1487,7 +1557,7 @@
       <w:r>
         <w:t xml:space="preserve"> </w:t>
       </w:r>
-      <w:hyperlink r:id="rId27">
+      <w:hyperlink r:id="rId28">
         <w:r>
           <w:rPr>
             <w:rStyle w:val="Hyperlink"/>
@@ -1504,7 +1574,7 @@
         <w:rPr>
           <w:rStyle w:val="CVNum"/>
         </w:rPr>
-        <w:t xml:space="preserve">32.</w:t>
+        <w:t xml:space="preserve">31.</w:t>
       </w:r>
       <w:r>
         <w:tab/>
@@ -1541,7 +1611,7 @@
       <w:r>
         <w:t xml:space="preserve"> </w:t>
       </w:r>
-      <w:hyperlink r:id="rId28">
+      <w:hyperlink r:id="rId29">
         <w:r>
           <w:rPr>
             <w:rStyle w:val="Hyperlink"/>
@@ -1558,7 +1628,7 @@
         <w:rPr>
           <w:rStyle w:val="CVNum"/>
         </w:rPr>
-        <w:t xml:space="preserve">31.</w:t>
+        <w:t xml:space="preserve">30.</w:t>
       </w:r>
       <w:r>
         <w:tab/>
@@ -1602,82 +1672,12 @@
       <w:r>
         <w:t xml:space="preserve"> </w:t>
       </w:r>
-      <w:hyperlink r:id="rId29">
+      <w:hyperlink r:id="rId30">
         <w:r>
           <w:rPr>
             <w:rStyle w:val="Hyperlink"/>
           </w:rPr>
           <w:t xml:space="preserve">doi:10.1016/j.ympev.2026.108549</w:t>
-        </w:r>
-      </w:hyperlink>
-    </w:p>
-    <w:p>
-      <w:pPr>
-        <w:pStyle w:val="CVPub"/>
-      </w:pPr>
-      <w:r>
-        <w:rPr>
-          <w:rStyle w:val="CVNum"/>
-        </w:rPr>
-        <w:t xml:space="preserve">30.</w:t>
-      </w:r>
-      <w:r>
-        <w:tab/>
-      </w:r>
-      <w:r>
-        <w:t xml:space="preserve">Pei, X., Li, Y.,</w:t>
-      </w:r>
-      <w:r>
-        <w:t xml:space="preserve"> </w:t>
-      </w:r>
-      <w:r>
-        <w:rPr>
-          <w:b/>
-          <w:bCs/>
-        </w:rPr>
-        <w:t xml:space="preserve">Onditi, K. O.</w:t>
-      </w:r>
-      <w:r>
-        <w:t xml:space="preserve">, Wang, H., Qin, W., Zhu, R., Li, Q., Song, W., Li, X., Zhu, Z., Chen, Z. &amp; Jiang, X. (2026). Phylogeny and evolutionary history of the genus</w:t>
-      </w:r>
-      <w:r>
-        <w:t xml:space="preserve"> </w:t>
-      </w:r>
-      <w:r>
-        <w:rPr>
-          <w:i/>
-          <w:iCs/>
-        </w:rPr>
-        <w:t xml:space="preserve">Nectogale</w:t>
-      </w:r>
-      <w:r>
-        <w:t xml:space="preserve"> </w:t>
-      </w:r>
-      <w:r>
-        <w:t xml:space="preserve">(Soricidae) inferred from whole–genome analyses, with description of a new species endemic to the Himalayas.</w:t>
-      </w:r>
-      <w:r>
-        <w:t xml:space="preserve"> </w:t>
-      </w:r>
-      <w:r>
-        <w:rPr>
-          <w:i/>
-          <w:iCs/>
-        </w:rPr>
-        <w:t xml:space="preserve">Molecular Phylogenetics and Evolution</w:t>
-      </w:r>
-      <w:r>
-        <w:t xml:space="preserve">, 108749.</w:t>
-      </w:r>
-      <w:r>
-        <w:t xml:space="preserve"> </w:t>
-      </w:r>
-      <w:hyperlink r:id="rId30">
-        <w:r>
-          <w:rPr>
-            <w:rStyle w:val="Hyperlink"/>
-          </w:rPr>
-          <w:t xml:space="preserve">doi:10.1016/j.ympev.2026.108749</w:t>
         </w:r>
       </w:hyperlink>
     </w:p>
@@ -4099,7 +4099,7 @@
         <w:tab/>
       </w:r>
       <w:r>
-        <w:t xml:space="preserve">76 review records for 24 journals, 2020–2026 (ORCID, 4 October 2026).</w:t>
+        <w:t xml:space="preserve">76 review records for 24 journals, 2020–2026 (ORCID, 16 October 2026).</w:t>
       </w:r>
     </w:p>
     <w:p>

</xml_diff>

<commit_message>
Publish Zoosystema paper and highlight Nectogale and Graphiurus
- Zoosystema 48(25): 741-789, doi:10.5252/zoosystema2026v48a25, published
  30 Oct 2026; details and abstract from the publisher PDF, now linked as
  pdfs/Hounmavo_2026_Assoukoko_small_mammals.pdf (CC-BY 4.0)
- Remove the accepted/in-press status; extraction note in publications/
- Flag the Nectogale and Graphiurus papers as homepage highlights
- CV: manual record until Crossref registers the DOI, then it yields to the
  cached Crossref record; rebuilt Word and PDF CVs

Co-Authored-By: Claude Opus 5.5 <noreply@anthropic.com>
</commit_message>
<xml_diff>
--- a/cv/OKOnditi_CV_2026.docx
+++ b/cv/OKOnditi_CV_2026.docx
@@ -274,7 +274,7 @@
                 <w:color w:val="8A6520"/>
                 <w:sz w:val="34"/>
               </w:rPr>
-              <w:t xml:space="preserve">414</w:t>
+              <w:t xml:space="preserve">418</w:t>
             </w:r>
           </w:p>
           <w:p>
@@ -428,7 +428,7 @@
         <w:pStyle w:val="CVNote"/>
       </w:pPr>
       <w:r>
-        <w:t xml:space="preserve">Citation figures: Google Scholar, 16 October 2026. Review records: ORCID, 16 October 2026. Articles: publication list below (1 in press).</w:t>
+        <w:t xml:space="preserve">Citation figures: Google Scholar, 29 October 2026. Review records: ORCID, 30 October 2026. Articles: publication list below.</w:t>
       </w:r>
     </w:p>
     <w:p>
@@ -1046,49 +1046,6 @@
           <w:rStyle w:val="CVNum"/>
         </w:rPr>
         <w:t xml:space="preserve">40.</w:t>
-      </w:r>
-      <w:r>
-        <w:tab/>
-      </w:r>
-      <w:r>
-        <w:t xml:space="preserve">Hounmavo, A., Segniagbeto, G. H.,</w:t>
-      </w:r>
-      <w:r>
-        <w:t xml:space="preserve"> </w:t>
-      </w:r>
-      <w:r>
-        <w:rPr>
-          <w:b/>
-          <w:bCs/>
-        </w:rPr>
-        <w:t xml:space="preserve">Onditi, K. O.</w:t>
-      </w:r>
-      <w:r>
-        <w:t xml:space="preserve">, Lutz, H. L., Delapré, A., Demos, T. C., Kerbis Peterhans, J. C. &amp; Nicolas, V. (in press). Small terrestrial mammal inventory of Assoukoko forest (Togo), with new country records and potential new species for science.</w:t>
-      </w:r>
-      <w:r>
-        <w:t xml:space="preserve"> </w:t>
-      </w:r>
-      <w:r>
-        <w:rPr>
-          <w:i/>
-          <w:iCs/>
-        </w:rPr>
-        <w:t xml:space="preserve">Zoosystema</w:t>
-      </w:r>
-      <w:r>
-        <w:t xml:space="preserve">. Accepted for publication 1 June 2026.</w:t>
-      </w:r>
-    </w:p>
-    <w:p>
-      <w:pPr>
-        <w:pStyle w:val="CVPub"/>
-      </w:pPr>
-      <w:r>
-        <w:rPr>
-          <w:rStyle w:val="CVNum"/>
-        </w:rPr>
-        <w:t xml:space="preserve">39.</w:t>
       </w:r>
       <w:r>
         <w:tab/>
@@ -1158,7 +1115,7 @@
         <w:rPr>
           <w:rStyle w:val="CVNum"/>
         </w:rPr>
-        <w:t xml:space="preserve">38.</w:t>
+        <w:t xml:space="preserve">39.</w:t>
       </w:r>
       <w:r>
         <w:tab/>
@@ -1231,7 +1188,7 @@
         <w:rPr>
           <w:rStyle w:val="CVNum"/>
         </w:rPr>
-        <w:t xml:space="preserve">37.</w:t>
+        <w:t xml:space="preserve">38.</w:t>
       </w:r>
       <w:r>
         <w:tab/>
@@ -1285,13 +1242,13 @@
         <w:rPr>
           <w:rStyle w:val="CVNum"/>
         </w:rPr>
-        <w:t xml:space="preserve">36.</w:t>
+        <w:t xml:space="preserve">37.</w:t>
       </w:r>
       <w:r>
         <w:tab/>
       </w:r>
       <w:r>
-        <w:t xml:space="preserve">Li, X., Hu, W.,</w:t>
+        <w:t xml:space="preserve">Hounmavo, A., Segniagbeto, G. H.,</w:t>
       </w:r>
       <w:r>
         <w:t xml:space="preserve"> </w:t>
@@ -1304,7 +1261,7 @@
         <w:t xml:space="preserve">Onditi, K. O.</w:t>
       </w:r>
       <w:r>
-        <w:t xml:space="preserve">, Hu, Z., Liu, Y., Wang, H. &amp; Jiang, X. (2026). Beyond species richness: Habitat fragmentation reduces community occupancy and functional richness of mountain forest mammals.</w:t>
+        <w:t xml:space="preserve">, Lutz, H. L., Delapré, A., Demos, T. C., Kerbis Peterhans, J. C. &amp; Nicolas, V. (2026). Small terrestrial mammal inventory of Assoukoko forest (Togo), with new country records and potential new species for science.</w:t>
       </w:r>
       <w:r>
         <w:t xml:space="preserve"> </w:t>
@@ -1314,6 +1271,60 @@
           <w:i/>
           <w:iCs/>
         </w:rPr>
+        <w:t xml:space="preserve">Zoosystema</w:t>
+      </w:r>
+      <w:r>
+        <w:t xml:space="preserve">, 48(25), 741–789.</w:t>
+      </w:r>
+      <w:r>
+        <w:t xml:space="preserve"> </w:t>
+      </w:r>
+      <w:hyperlink r:id="rId24">
+        <w:r>
+          <w:rPr>
+            <w:rStyle w:val="Hyperlink"/>
+          </w:rPr>
+          <w:t xml:space="preserve">doi:10.5252/zoosystema2026v48a25</w:t>
+        </w:r>
+      </w:hyperlink>
+    </w:p>
+    <w:p>
+      <w:pPr>
+        <w:pStyle w:val="CVPub"/>
+      </w:pPr>
+      <w:r>
+        <w:rPr>
+          <w:rStyle w:val="CVNum"/>
+        </w:rPr>
+        <w:t xml:space="preserve">36.</w:t>
+      </w:r>
+      <w:r>
+        <w:tab/>
+      </w:r>
+      <w:r>
+        <w:t xml:space="preserve">Li, X., Hu, W.,</w:t>
+      </w:r>
+      <w:r>
+        <w:t xml:space="preserve"> </w:t>
+      </w:r>
+      <w:r>
+        <w:rPr>
+          <w:b/>
+          <w:bCs/>
+        </w:rPr>
+        <w:t xml:space="preserve">Onditi, K. O.</w:t>
+      </w:r>
+      <w:r>
+        <w:t xml:space="preserve">, Hu, Z., Liu, Y., Wang, H. &amp; Jiang, X. (2026). Beyond species richness: Habitat fragmentation reduces community occupancy and functional richness of mountain forest mammals.</w:t>
+      </w:r>
+      <w:r>
+        <w:t xml:space="preserve"> </w:t>
+      </w:r>
+      <w:r>
+        <w:rPr>
+          <w:i/>
+          <w:iCs/>
+        </w:rPr>
         <w:t xml:space="preserve">Biological Conservation</w:t>
       </w:r>
       <w:r>
@@ -1322,7 +1333,7 @@
       <w:r>
         <w:t xml:space="preserve"> </w:t>
       </w:r>
-      <w:hyperlink r:id="rId24">
+      <w:hyperlink r:id="rId25">
         <w:r>
           <w:rPr>
             <w:rStyle w:val="Hyperlink"/>
@@ -1376,7 +1387,7 @@
       <w:r>
         <w:t xml:space="preserve"> </w:t>
       </w:r>
-      <w:hyperlink r:id="rId25">
+      <w:hyperlink r:id="rId26">
         <w:r>
           <w:rPr>
             <w:rStyle w:val="Hyperlink"/>
@@ -1430,7 +1441,7 @@
       <w:r>
         <w:t xml:space="preserve"> </w:t>
       </w:r>
-      <w:hyperlink r:id="rId26">
+      <w:hyperlink r:id="rId27">
         <w:r>
           <w:rPr>
             <w:rStyle w:val="Hyperlink"/>
@@ -1500,7 +1511,7 @@
       <w:r>
         <w:t xml:space="preserve"> </w:t>
       </w:r>
-      <w:hyperlink r:id="rId27">
+      <w:hyperlink r:id="rId28">
         <w:r>
           <w:rPr>
             <w:rStyle w:val="Hyperlink"/>
@@ -1557,7 +1568,7 @@
       <w:r>
         <w:t xml:space="preserve"> </w:t>
       </w:r>
-      <w:hyperlink r:id="rId28">
+      <w:hyperlink r:id="rId29">
         <w:r>
           <w:rPr>
             <w:rStyle w:val="Hyperlink"/>
@@ -1611,7 +1622,7 @@
       <w:r>
         <w:t xml:space="preserve"> </w:t>
       </w:r>
-      <w:hyperlink r:id="rId29">
+      <w:hyperlink r:id="rId30">
         <w:r>
           <w:rPr>
             <w:rStyle w:val="Hyperlink"/>
@@ -1672,7 +1683,7 @@
       <w:r>
         <w:t xml:space="preserve"> </w:t>
       </w:r>
-      <w:hyperlink r:id="rId30">
+      <w:hyperlink r:id="rId31">
         <w:r>
           <w:rPr>
             <w:rStyle w:val="Hyperlink"/>
@@ -1726,7 +1737,7 @@
       <w:r>
         <w:t xml:space="preserve"> </w:t>
       </w:r>
-      <w:hyperlink r:id="rId31">
+      <w:hyperlink r:id="rId32">
         <w:r>
           <w:rPr>
             <w:rStyle w:val="Hyperlink"/>
@@ -1780,7 +1791,7 @@
       <w:r>
         <w:t xml:space="preserve"> </w:t>
       </w:r>
-      <w:hyperlink r:id="rId32">
+      <w:hyperlink r:id="rId33">
         <w:r>
           <w:rPr>
             <w:rStyle w:val="Hyperlink"/>
@@ -1834,7 +1845,7 @@
       <w:r>
         <w:t xml:space="preserve"> </w:t>
       </w:r>
-      <w:hyperlink r:id="rId33">
+      <w:hyperlink r:id="rId34">
         <w:r>
           <w:rPr>
             <w:rStyle w:val="Hyperlink"/>
@@ -1888,7 +1899,7 @@
       <w:r>
         <w:t xml:space="preserve"> </w:t>
       </w:r>
-      <w:hyperlink r:id="rId34">
+      <w:hyperlink r:id="rId35">
         <w:r>
           <w:rPr>
             <w:rStyle w:val="Hyperlink"/>
@@ -1936,7 +1947,7 @@
       <w:r>
         <w:t xml:space="preserve"> </w:t>
       </w:r>
-      <w:hyperlink r:id="rId35">
+      <w:hyperlink r:id="rId36">
         <w:r>
           <w:rPr>
             <w:rStyle w:val="Hyperlink"/>
@@ -2003,7 +2014,7 @@
       <w:r>
         <w:t xml:space="preserve"> </w:t>
       </w:r>
-      <w:hyperlink r:id="rId36">
+      <w:hyperlink r:id="rId37">
         <w:r>
           <w:rPr>
             <w:rStyle w:val="Hyperlink"/>
@@ -2057,7 +2068,7 @@
       <w:r>
         <w:t xml:space="preserve"> </w:t>
       </w:r>
-      <w:hyperlink r:id="rId37">
+      <w:hyperlink r:id="rId38">
         <w:r>
           <w:rPr>
             <w:rStyle w:val="Hyperlink"/>
@@ -2111,7 +2122,7 @@
       <w:r>
         <w:t xml:space="preserve"> </w:t>
       </w:r>
-      <w:hyperlink r:id="rId38">
+      <w:hyperlink r:id="rId39">
         <w:r>
           <w:rPr>
             <w:rStyle w:val="Hyperlink"/>
@@ -2159,7 +2170,7 @@
       <w:r>
         <w:t xml:space="preserve"> </w:t>
       </w:r>
-      <w:hyperlink r:id="rId39">
+      <w:hyperlink r:id="rId40">
         <w:r>
           <w:rPr>
             <w:rStyle w:val="Hyperlink"/>
@@ -2226,7 +2237,7 @@
       <w:r>
         <w:t xml:space="preserve"> </w:t>
       </w:r>
-      <w:hyperlink r:id="rId40">
+      <w:hyperlink r:id="rId41">
         <w:r>
           <w:rPr>
             <w:rStyle w:val="Hyperlink"/>
@@ -2296,7 +2307,7 @@
       <w:r>
         <w:t xml:space="preserve"> </w:t>
       </w:r>
-      <w:hyperlink r:id="rId41">
+      <w:hyperlink r:id="rId42">
         <w:r>
           <w:rPr>
             <w:rStyle w:val="Hyperlink"/>
@@ -2353,7 +2364,7 @@
       <w:r>
         <w:t xml:space="preserve"> </w:t>
       </w:r>
-      <w:hyperlink r:id="rId42">
+      <w:hyperlink r:id="rId43">
         <w:r>
           <w:rPr>
             <w:rStyle w:val="Hyperlink"/>
@@ -2401,7 +2412,7 @@
       <w:r>
         <w:t xml:space="preserve"> </w:t>
       </w:r>
-      <w:hyperlink r:id="rId43">
+      <w:hyperlink r:id="rId44">
         <w:r>
           <w:rPr>
             <w:rStyle w:val="Hyperlink"/>
@@ -2455,7 +2466,7 @@
       <w:r>
         <w:t xml:space="preserve"> </w:t>
       </w:r>
-      <w:hyperlink r:id="rId44">
+      <w:hyperlink r:id="rId45">
         <w:r>
           <w:rPr>
             <w:rStyle w:val="Hyperlink"/>
@@ -2519,7 +2530,7 @@
       <w:r>
         <w:t xml:space="preserve"> </w:t>
       </w:r>
-      <w:hyperlink r:id="rId45">
+      <w:hyperlink r:id="rId46">
         <w:r>
           <w:rPr>
             <w:rStyle w:val="Hyperlink"/>
@@ -2573,7 +2584,7 @@
       <w:r>
         <w:t xml:space="preserve"> </w:t>
       </w:r>
-      <w:hyperlink r:id="rId46">
+      <w:hyperlink r:id="rId47">
         <w:r>
           <w:rPr>
             <w:rStyle w:val="Hyperlink"/>
@@ -2627,7 +2638,7 @@
       <w:r>
         <w:t xml:space="preserve"> </w:t>
       </w:r>
-      <w:hyperlink r:id="rId47">
+      <w:hyperlink r:id="rId48">
         <w:r>
           <w:rPr>
             <w:rStyle w:val="Hyperlink"/>
@@ -2700,7 +2711,7 @@
       <w:r>
         <w:t xml:space="preserve"> </w:t>
       </w:r>
-      <w:hyperlink r:id="rId48">
+      <w:hyperlink r:id="rId49">
         <w:r>
           <w:rPr>
             <w:rStyle w:val="Hyperlink"/>
@@ -2780,7 +2791,7 @@
       <w:r>
         <w:t xml:space="preserve"> </w:t>
       </w:r>
-      <w:hyperlink r:id="rId49">
+      <w:hyperlink r:id="rId50">
         <w:r>
           <w:rPr>
             <w:rStyle w:val="Hyperlink"/>
@@ -2828,7 +2839,7 @@
       <w:r>
         <w:t xml:space="preserve"> </w:t>
       </w:r>
-      <w:hyperlink r:id="rId50">
+      <w:hyperlink r:id="rId51">
         <w:r>
           <w:rPr>
             <w:rStyle w:val="Hyperlink"/>
@@ -2882,7 +2893,7 @@
       <w:r>
         <w:t xml:space="preserve"> </w:t>
       </w:r>
-      <w:hyperlink r:id="rId51">
+      <w:hyperlink r:id="rId52">
         <w:r>
           <w:rPr>
             <w:rStyle w:val="Hyperlink"/>
@@ -2939,7 +2950,7 @@
       <w:r>
         <w:t xml:space="preserve"> </w:t>
       </w:r>
-      <w:hyperlink r:id="rId52">
+      <w:hyperlink r:id="rId53">
         <w:r>
           <w:rPr>
             <w:rStyle w:val="Hyperlink"/>
@@ -2993,7 +3004,7 @@
       <w:r>
         <w:t xml:space="preserve"> </w:t>
       </w:r>
-      <w:hyperlink r:id="rId53">
+      <w:hyperlink r:id="rId54">
         <w:r>
           <w:rPr>
             <w:rStyle w:val="Hyperlink"/>
@@ -3041,7 +3052,7 @@
       <w:r>
         <w:t xml:space="preserve"> </w:t>
       </w:r>
-      <w:hyperlink r:id="rId54">
+      <w:hyperlink r:id="rId55">
         <w:r>
           <w:rPr>
             <w:rStyle w:val="Hyperlink"/>
@@ -3102,7 +3113,7 @@
       <w:r>
         <w:t xml:space="preserve"> </w:t>
       </w:r>
-      <w:hyperlink r:id="rId55">
+      <w:hyperlink r:id="rId56">
         <w:r>
           <w:rPr>
             <w:rStyle w:val="Hyperlink"/>
@@ -3156,7 +3167,7 @@
       <w:r>
         <w:t xml:space="preserve"> </w:t>
       </w:r>
-      <w:hyperlink r:id="rId56">
+      <w:hyperlink r:id="rId57">
         <w:r>
           <w:rPr>
             <w:rStyle w:val="Hyperlink"/>
@@ -3217,7 +3228,7 @@
       <w:r>
         <w:t xml:space="preserve"> </w:t>
       </w:r>
-      <w:hyperlink r:id="rId57">
+      <w:hyperlink r:id="rId58">
         <w:r>
           <w:rPr>
             <w:rStyle w:val="Hyperlink"/>
@@ -3271,7 +3282,7 @@
       <w:r>
         <w:t xml:space="preserve"> </w:t>
       </w:r>
-      <w:hyperlink r:id="rId58">
+      <w:hyperlink r:id="rId59">
         <w:r>
           <w:rPr>
             <w:rStyle w:val="Hyperlink"/>
@@ -3325,7 +3336,7 @@
       <w:r>
         <w:t xml:space="preserve"> </w:t>
       </w:r>
-      <w:hyperlink r:id="rId59">
+      <w:hyperlink r:id="rId60">
         <w:r>
           <w:rPr>
             <w:rStyle w:val="Hyperlink"/>
@@ -3390,7 +3401,7 @@
       <w:r>
         <w:t xml:space="preserve"> </w:t>
       </w:r>
-      <w:hyperlink r:id="rId60">
+      <w:hyperlink r:id="rId61">
         <w:r>
           <w:rPr>
             <w:rStyle w:val="Hyperlink"/>
@@ -3447,7 +3458,7 @@
       <w:r>
         <w:t xml:space="preserve"> </w:t>
       </w:r>
-      <w:hyperlink r:id="rId61">
+      <w:hyperlink r:id="rId62">
         <w:r>
           <w:rPr>
             <w:rStyle w:val="Hyperlink"/>
@@ -4099,7 +4110,7 @@
         <w:tab/>
       </w:r>
       <w:r>
-        <w:t xml:space="preserve">76 review records for 24 journals, 2020–2026 (ORCID, 16 October 2026).</w:t>
+        <w:t xml:space="preserve">76 review records for 24 journals, 2020–2026 (ORCID, 30 October 2026).</w:t>
       </w:r>
     </w:p>
     <w:p>

</xml_diff>

<commit_message>
Add Wang et al. 2026 Ecology and Evolution beta-diversity paper
Add the published record for 'The Synergy Between Deterministic and Neutral
Processes Drives Turnover-Dominated Beta Diversity of Non-Volant Small Mammals
in the Western Tianshan Mountains, China' (Ecol Evol 16(11): e74538,
10.1002/ece3.74538, open access). Refresh publication cards, homepage
highlights, metric fallbacks and the CV.
</commit_message>
<xml_diff>
--- a/cv/OKOnditi_CV_2026.docx
+++ b/cv/OKOnditi_CV_2026.docx
@@ -190,7 +190,7 @@
                 <w:color w:val="8A6520"/>
                 <w:sz w:val="34"/>
               </w:rPr>
-              <w:t xml:space="preserve">40</w:t>
+              <w:t xml:space="preserve">41</w:t>
             </w:r>
           </w:p>
           <w:p>
@@ -1034,7 +1034,7 @@
         <w:pStyle w:val="CVSubhead"/>
       </w:pPr>
       <w:r>
-        <w:t xml:space="preserve">Peer-reviewed journal articles (40)</w:t>
+        <w:t xml:space="preserve">Peer-reviewed journal articles (41)</w:t>
       </w:r>
     </w:p>
     <w:p>
@@ -1045,7 +1045,7 @@
         <w:rPr>
           <w:rStyle w:val="CVNum"/>
         </w:rPr>
-        <w:t xml:space="preserve">40.</w:t>
+        <w:t xml:space="preserve">41.</w:t>
       </w:r>
       <w:r>
         <w:tab/>
@@ -1115,7 +1115,7 @@
         <w:rPr>
           <w:rStyle w:val="CVNum"/>
         </w:rPr>
-        <w:t xml:space="preserve">39.</w:t>
+        <w:t xml:space="preserve">40.</w:t>
       </w:r>
       <w:r>
         <w:tab/>
@@ -1188,7 +1188,7 @@
         <w:rPr>
           <w:rStyle w:val="CVNum"/>
         </w:rPr>
-        <w:t xml:space="preserve">38.</w:t>
+        <w:t xml:space="preserve">39.</w:t>
       </w:r>
       <w:r>
         <w:tab/>
@@ -1242,7 +1242,7 @@
         <w:rPr>
           <w:rStyle w:val="CVNum"/>
         </w:rPr>
-        <w:t xml:space="preserve">37.</w:t>
+        <w:t xml:space="preserve">38.</w:t>
       </w:r>
       <w:r>
         <w:tab/>
@@ -1296,7 +1296,7 @@
         <w:rPr>
           <w:rStyle w:val="CVNum"/>
         </w:rPr>
-        <w:t xml:space="preserve">36.</w:t>
+        <w:t xml:space="preserve">37.</w:t>
       </w:r>
       <w:r>
         <w:tab/>
@@ -1350,7 +1350,7 @@
         <w:rPr>
           <w:rStyle w:val="CVNum"/>
         </w:rPr>
-        <w:t xml:space="preserve">35.</w:t>
+        <w:t xml:space="preserve">36.</w:t>
       </w:r>
       <w:r>
         <w:tab/>
@@ -1404,7 +1404,7 @@
         <w:rPr>
           <w:rStyle w:val="CVNum"/>
         </w:rPr>
-        <w:t xml:space="preserve">34.</w:t>
+        <w:t xml:space="preserve">35.</w:t>
       </w:r>
       <w:r>
         <w:tab/>
@@ -1458,7 +1458,7 @@
         <w:rPr>
           <w:rStyle w:val="CVNum"/>
         </w:rPr>
-        <w:t xml:space="preserve">33.</w:t>
+        <w:t xml:space="preserve">34.</w:t>
       </w:r>
       <w:r>
         <w:tab/>
@@ -1528,7 +1528,7 @@
         <w:rPr>
           <w:rStyle w:val="CVNum"/>
         </w:rPr>
-        <w:t xml:space="preserve">32.</w:t>
+        <w:t xml:space="preserve">33.</w:t>
       </w:r>
       <w:r>
         <w:tab/>
@@ -1585,7 +1585,7 @@
         <w:rPr>
           <w:rStyle w:val="CVNum"/>
         </w:rPr>
-        <w:t xml:space="preserve">31.</w:t>
+        <w:t xml:space="preserve">32.</w:t>
       </w:r>
       <w:r>
         <w:tab/>
@@ -1639,7 +1639,7 @@
         <w:rPr>
           <w:rStyle w:val="CVNum"/>
         </w:rPr>
-        <w:t xml:space="preserve">30.</w:t>
+        <w:t xml:space="preserve">31.</w:t>
       </w:r>
       <w:r>
         <w:tab/>
@@ -1700,13 +1700,13 @@
         <w:rPr>
           <w:rStyle w:val="CVNum"/>
         </w:rPr>
-        <w:t xml:space="preserve">29.</w:t>
+        <w:t xml:space="preserve">30.</w:t>
       </w:r>
       <w:r>
         <w:tab/>
       </w:r>
       <w:r>
-        <w:t xml:space="preserve">Bai, R., Ji, Y., Hu, W., Hu, Z., He, S.,</w:t>
+        <w:t xml:space="preserve">Wang, X., Song, W., Xing, Y., Wang, Y., Pei, X.,</w:t>
       </w:r>
       <w:r>
         <w:t xml:space="preserve"> </w:t>
@@ -1719,7 +1719,7 @@
         <w:t xml:space="preserve">Onditi, K. O.</w:t>
       </w:r>
       <w:r>
-        <w:t xml:space="preserve">, Wang, H., Xiong, Y., Zhang, J., Jiang, X. &amp; Li, X. (2025). Seasonal differences and downstream transport of terrestrial vertebrate eDNA: Insights from integrated camera-trap survey and water eDNA metabarcoding.</w:t>
+        <w:t xml:space="preserve">, Wang, H., Li, Q., Li, X., Chen, Z. &amp; Jiang, X. (2026). The Synergy Between Deterministic and Neutral Processes Drives Turnover-Dominated Beta Diversity of Non-Volant Small Mammals in the Western Tianshan Mountains, China.</w:t>
       </w:r>
       <w:r>
         <w:t xml:space="preserve"> </w:t>
@@ -1729,6 +1729,60 @@
           <w:i/>
           <w:iCs/>
         </w:rPr>
+        <w:t xml:space="preserve">Ecology and Evolution</w:t>
+      </w:r>
+      <w:r>
+        <w:t xml:space="preserve">, 16(11), e74538.</w:t>
+      </w:r>
+      <w:r>
+        <w:t xml:space="preserve"> </w:t>
+      </w:r>
+      <w:hyperlink r:id="rId32">
+        <w:r>
+          <w:rPr>
+            <w:rStyle w:val="Hyperlink"/>
+          </w:rPr>
+          <w:t xml:space="preserve">doi:10.1002/ece3.74538</w:t>
+        </w:r>
+      </w:hyperlink>
+    </w:p>
+    <w:p>
+      <w:pPr>
+        <w:pStyle w:val="CVPub"/>
+      </w:pPr>
+      <w:r>
+        <w:rPr>
+          <w:rStyle w:val="CVNum"/>
+        </w:rPr>
+        <w:t xml:space="preserve">29.</w:t>
+      </w:r>
+      <w:r>
+        <w:tab/>
+      </w:r>
+      <w:r>
+        <w:t xml:space="preserve">Bai, R., Ji, Y., Hu, W., Hu, Z., He, S.,</w:t>
+      </w:r>
+      <w:r>
+        <w:t xml:space="preserve"> </w:t>
+      </w:r>
+      <w:r>
+        <w:rPr>
+          <w:b/>
+          <w:bCs/>
+        </w:rPr>
+        <w:t xml:space="preserve">Onditi, K. O.</w:t>
+      </w:r>
+      <w:r>
+        <w:t xml:space="preserve">, Wang, H., Xiong, Y., Zhang, J., Jiang, X. &amp; Li, X. (2025). Seasonal differences and downstream transport of terrestrial vertebrate eDNA: Insights from integrated camera-trap survey and water eDNA metabarcoding.</w:t>
+      </w:r>
+      <w:r>
+        <w:t xml:space="preserve"> </w:t>
+      </w:r>
+      <w:r>
+        <w:rPr>
+          <w:i/>
+          <w:iCs/>
+        </w:rPr>
         <w:t xml:space="preserve">Global Ecology and Conservation</w:t>
       </w:r>
       <w:r>
@@ -1737,7 +1791,7 @@
       <w:r>
         <w:t xml:space="preserve"> </w:t>
       </w:r>
-      <w:hyperlink r:id="rId32">
+      <w:hyperlink r:id="rId33">
         <w:r>
           <w:rPr>
             <w:rStyle w:val="Hyperlink"/>
@@ -1791,7 +1845,7 @@
       <w:r>
         <w:t xml:space="preserve"> </w:t>
       </w:r>
-      <w:hyperlink r:id="rId33">
+      <w:hyperlink r:id="rId34">
         <w:r>
           <w:rPr>
             <w:rStyle w:val="Hyperlink"/>
@@ -1845,7 +1899,7 @@
       <w:r>
         <w:t xml:space="preserve"> </w:t>
       </w:r>
-      <w:hyperlink r:id="rId34">
+      <w:hyperlink r:id="rId35">
         <w:r>
           <w:rPr>
             <w:rStyle w:val="Hyperlink"/>
@@ -1899,7 +1953,7 @@
       <w:r>
         <w:t xml:space="preserve"> </w:t>
       </w:r>
-      <w:hyperlink r:id="rId35">
+      <w:hyperlink r:id="rId36">
         <w:r>
           <w:rPr>
             <w:rStyle w:val="Hyperlink"/>
@@ -1947,7 +2001,7 @@
       <w:r>
         <w:t xml:space="preserve"> </w:t>
       </w:r>
-      <w:hyperlink r:id="rId36">
+      <w:hyperlink r:id="rId37">
         <w:r>
           <w:rPr>
             <w:rStyle w:val="Hyperlink"/>
@@ -2014,7 +2068,7 @@
       <w:r>
         <w:t xml:space="preserve"> </w:t>
       </w:r>
-      <w:hyperlink r:id="rId37">
+      <w:hyperlink r:id="rId38">
         <w:r>
           <w:rPr>
             <w:rStyle w:val="Hyperlink"/>
@@ -2068,7 +2122,7 @@
       <w:r>
         <w:t xml:space="preserve"> </w:t>
       </w:r>
-      <w:hyperlink r:id="rId38">
+      <w:hyperlink r:id="rId39">
         <w:r>
           <w:rPr>
             <w:rStyle w:val="Hyperlink"/>
@@ -2122,7 +2176,7 @@
       <w:r>
         <w:t xml:space="preserve"> </w:t>
       </w:r>
-      <w:hyperlink r:id="rId39">
+      <w:hyperlink r:id="rId40">
         <w:r>
           <w:rPr>
             <w:rStyle w:val="Hyperlink"/>
@@ -2170,7 +2224,7 @@
       <w:r>
         <w:t xml:space="preserve"> </w:t>
       </w:r>
-      <w:hyperlink r:id="rId40">
+      <w:hyperlink r:id="rId41">
         <w:r>
           <w:rPr>
             <w:rStyle w:val="Hyperlink"/>
@@ -2237,7 +2291,7 @@
       <w:r>
         <w:t xml:space="preserve"> </w:t>
       </w:r>
-      <w:hyperlink r:id="rId41">
+      <w:hyperlink r:id="rId42">
         <w:r>
           <w:rPr>
             <w:rStyle w:val="Hyperlink"/>
@@ -2307,7 +2361,7 @@
       <w:r>
         <w:t xml:space="preserve"> </w:t>
       </w:r>
-      <w:hyperlink r:id="rId42">
+      <w:hyperlink r:id="rId43">
         <w:r>
           <w:rPr>
             <w:rStyle w:val="Hyperlink"/>
@@ -2364,7 +2418,7 @@
       <w:r>
         <w:t xml:space="preserve"> </w:t>
       </w:r>
-      <w:hyperlink r:id="rId43">
+      <w:hyperlink r:id="rId44">
         <w:r>
           <w:rPr>
             <w:rStyle w:val="Hyperlink"/>
@@ -2412,7 +2466,7 @@
       <w:r>
         <w:t xml:space="preserve"> </w:t>
       </w:r>
-      <w:hyperlink r:id="rId44">
+      <w:hyperlink r:id="rId45">
         <w:r>
           <w:rPr>
             <w:rStyle w:val="Hyperlink"/>
@@ -2466,7 +2520,7 @@
       <w:r>
         <w:t xml:space="preserve"> </w:t>
       </w:r>
-      <w:hyperlink r:id="rId45">
+      <w:hyperlink r:id="rId46">
         <w:r>
           <w:rPr>
             <w:rStyle w:val="Hyperlink"/>
@@ -2530,7 +2584,7 @@
       <w:r>
         <w:t xml:space="preserve"> </w:t>
       </w:r>
-      <w:hyperlink r:id="rId46">
+      <w:hyperlink r:id="rId47">
         <w:r>
           <w:rPr>
             <w:rStyle w:val="Hyperlink"/>
@@ -2584,7 +2638,7 @@
       <w:r>
         <w:t xml:space="preserve"> </w:t>
       </w:r>
-      <w:hyperlink r:id="rId47">
+      <w:hyperlink r:id="rId48">
         <w:r>
           <w:rPr>
             <w:rStyle w:val="Hyperlink"/>
@@ -2638,7 +2692,7 @@
       <w:r>
         <w:t xml:space="preserve"> </w:t>
       </w:r>
-      <w:hyperlink r:id="rId48">
+      <w:hyperlink r:id="rId49">
         <w:r>
           <w:rPr>
             <w:rStyle w:val="Hyperlink"/>
@@ -2711,7 +2765,7 @@
       <w:r>
         <w:t xml:space="preserve"> </w:t>
       </w:r>
-      <w:hyperlink r:id="rId49">
+      <w:hyperlink r:id="rId50">
         <w:r>
           <w:rPr>
             <w:rStyle w:val="Hyperlink"/>
@@ -2791,7 +2845,7 @@
       <w:r>
         <w:t xml:space="preserve"> </w:t>
       </w:r>
-      <w:hyperlink r:id="rId50">
+      <w:hyperlink r:id="rId51">
         <w:r>
           <w:rPr>
             <w:rStyle w:val="Hyperlink"/>
@@ -2839,7 +2893,7 @@
       <w:r>
         <w:t xml:space="preserve"> </w:t>
       </w:r>
-      <w:hyperlink r:id="rId51">
+      <w:hyperlink r:id="rId52">
         <w:r>
           <w:rPr>
             <w:rStyle w:val="Hyperlink"/>
@@ -2893,7 +2947,7 @@
       <w:r>
         <w:t xml:space="preserve"> </w:t>
       </w:r>
-      <w:hyperlink r:id="rId52">
+      <w:hyperlink r:id="rId53">
         <w:r>
           <w:rPr>
             <w:rStyle w:val="Hyperlink"/>
@@ -2950,7 +3004,7 @@
       <w:r>
         <w:t xml:space="preserve"> </w:t>
       </w:r>
-      <w:hyperlink r:id="rId53">
+      <w:hyperlink r:id="rId54">
         <w:r>
           <w:rPr>
             <w:rStyle w:val="Hyperlink"/>
@@ -3004,7 +3058,7 @@
       <w:r>
         <w:t xml:space="preserve"> </w:t>
       </w:r>
-      <w:hyperlink r:id="rId54">
+      <w:hyperlink r:id="rId55">
         <w:r>
           <w:rPr>
             <w:rStyle w:val="Hyperlink"/>
@@ -3052,7 +3106,7 @@
       <w:r>
         <w:t xml:space="preserve"> </w:t>
       </w:r>
-      <w:hyperlink r:id="rId55">
+      <w:hyperlink r:id="rId56">
         <w:r>
           <w:rPr>
             <w:rStyle w:val="Hyperlink"/>
@@ -3113,7 +3167,7 @@
       <w:r>
         <w:t xml:space="preserve"> </w:t>
       </w:r>
-      <w:hyperlink r:id="rId56">
+      <w:hyperlink r:id="rId57">
         <w:r>
           <w:rPr>
             <w:rStyle w:val="Hyperlink"/>
@@ -3167,7 +3221,7 @@
       <w:r>
         <w:t xml:space="preserve"> </w:t>
       </w:r>
-      <w:hyperlink r:id="rId57">
+      <w:hyperlink r:id="rId58">
         <w:r>
           <w:rPr>
             <w:rStyle w:val="Hyperlink"/>
@@ -3228,7 +3282,7 @@
       <w:r>
         <w:t xml:space="preserve"> </w:t>
       </w:r>
-      <w:hyperlink r:id="rId58">
+      <w:hyperlink r:id="rId59">
         <w:r>
           <w:rPr>
             <w:rStyle w:val="Hyperlink"/>
@@ -3282,7 +3336,7 @@
       <w:r>
         <w:t xml:space="preserve"> </w:t>
       </w:r>
-      <w:hyperlink r:id="rId59">
+      <w:hyperlink r:id="rId60">
         <w:r>
           <w:rPr>
             <w:rStyle w:val="Hyperlink"/>
@@ -3336,7 +3390,7 @@
       <w:r>
         <w:t xml:space="preserve"> </w:t>
       </w:r>
-      <w:hyperlink r:id="rId60">
+      <w:hyperlink r:id="rId61">
         <w:r>
           <w:rPr>
             <w:rStyle w:val="Hyperlink"/>
@@ -3401,7 +3455,7 @@
       <w:r>
         <w:t xml:space="preserve"> </w:t>
       </w:r>
-      <w:hyperlink r:id="rId61">
+      <w:hyperlink r:id="rId62">
         <w:r>
           <w:rPr>
             <w:rStyle w:val="Hyperlink"/>
@@ -3458,7 +3512,7 @@
       <w:r>
         <w:t xml:space="preserve"> </w:t>
       </w:r>
-      <w:hyperlink r:id="rId62">
+      <w:hyperlink r:id="rId63">
         <w:r>
           <w:rPr>
             <w:rStyle w:val="Hyperlink"/>

</xml_diff>

<commit_message>
Count corresponding-author papers in the CV key figures
Rename 'First-author articles' to 'First/Corresponding-author articles'
(8 -> 11) and drive it from the library's corresponding-author flag,
matching the publications-page filter. Rebuild the Word/PDF CV.
</commit_message>
<xml_diff>
--- a/cv/OKOnditi_CV_2026.docx
+++ b/cv/OKOnditi_CV_2026.docx
@@ -232,7 +232,7 @@
                 <w:color w:val="8A6520"/>
                 <w:sz w:val="34"/>
               </w:rPr>
-              <w:t xml:space="preserve">8</w:t>
+              <w:t xml:space="preserve">11</w:t>
             </w:r>
           </w:p>
           <w:p>
@@ -249,7 +249,7 @@
                 <w:spacing w:val="6"/>
                 <w:sz w:val="15"/>
               </w:rPr>
-              <w:t xml:space="preserve">First-author articles</w:t>
+              <w:t xml:space="preserve">First/Corresponding-author articles</w:t>
             </w:r>
           </w:p>
         </w:tc>

</xml_diff>